<commit_message>
feat(site): clickable cards, topic reorganization, fuller Psalm 110 scripts
Stretched-link overlay makes the text half of every episode card navigate
to the episode (title/scripture chips keep targets; thumbnail keeps the
lightbox). Topics rebuilt per the owner rules: Apologetics, Christian
Living & Discipleship (merged), Christology, Doctrine & Theology, Special
Episodes; Faith & Trust removed; Haggai P2 untopiced; alphabetical order;
new descriptions; assignment adds per instruction. Psalm 110 manuscripts
replaced with updated scripts containing full quoted passages (wording
verified 1.0 again) and their notes downloads refreshed. Resources copy
revised + alphabetized. SoF cards/buttons route to the SoF page.

Co-Authored-By: Claude Fable 5 <noreply@anthropic.com>
</commit_message>
<xml_diff>
--- a/static/notes/the-order-of-melchizedek.docx
+++ b/static/notes/the-order-of-melchizedek.docx
@@ -573,40 +573,74 @@
     <w:p>
       <w:pPr>
         <w:rPr>
-          <w:rFonts w:ascii="Bookman Old Style" w:eastAsia="Times New Roman" w:hAnsi="Bookman Old Style" w:cs="Times New Roman"/>
-          <w:kern w:val="0"/>
-          <w14:ligatures w14:val="none"/>
-        </w:rPr>
-      </w:pPr>
-      <w:r>
-        <w:rPr>
-          <w:rFonts w:ascii="Bookman Old Style" w:eastAsia="Times New Roman" w:hAnsi="Bookman Old Style" w:cs="Times New Roman"/>
-          <w:i/>
-          <w:iCs/>
-          <w:kern w:val="0"/>
-          <w14:ligatures w14:val="none"/>
-        </w:rPr>
-        <w:t xml:space="preserve">Read </w:t>
-      </w:r>
-      <w:r>
-        <w:rPr>
-          <w:rFonts w:ascii="Bookman Old Style" w:eastAsia="Times New Roman" w:hAnsi="Bookman Old Style" w:cs="Times New Roman"/>
-          <w:i/>
-          <w:iCs/>
-          <w:kern w:val="0"/>
-          <w14:ligatures w14:val="none"/>
-        </w:rPr>
-        <w:t xml:space="preserve">verse </w:t>
-      </w:r>
-      <w:r>
-        <w:rPr>
-          <w:rFonts w:ascii="Bookman Old Style" w:eastAsia="Times New Roman" w:hAnsi="Bookman Old Style" w:cs="Times New Roman"/>
-          <w:i/>
-          <w:iCs/>
-          <w:kern w:val="0"/>
-          <w14:ligatures w14:val="none"/>
-        </w:rPr>
-        <w:t>4</w:t>
+          <w:rFonts w:ascii="Bookman Old Style" w:eastAsia="Times New Roman" w:hAnsi="Bookman Old Style" w:cstheme="minorHAnsi"/>
+          <w:color w:val="5B9BD5" w:themeColor="accent5"/>
+          <w:kern w:val="0"/>
+          <w14:ligatures w14:val="none"/>
+        </w:rPr>
+      </w:pPr>
+      <w:r>
+        <w:rPr>
+          <w:rFonts w:ascii="Bookman Old Style" w:eastAsia="Times New Roman" w:hAnsi="Bookman Old Style" w:cstheme="minorHAnsi"/>
+          <w:color w:val="5B9BD5" w:themeColor="accent5"/>
+          <w:kern w:val="0"/>
+          <w14:ligatures w14:val="none"/>
+        </w:rPr>
+        <w:t>The Lord has sworn</w:t>
+      </w:r>
+      <w:r>
+        <w:rPr>
+          <w:rFonts w:ascii="Bookman Old Style" w:eastAsia="Times New Roman" w:hAnsi="Bookman Old Style" w:cstheme="minorHAnsi"/>
+          <w:color w:val="5B9BD5" w:themeColor="accent5"/>
+          <w:kern w:val="0"/>
+          <w14:ligatures w14:val="none"/>
+        </w:rPr>
+        <w:br/>
+      </w:r>
+      <w:r>
+        <w:rPr>
+          <w:rFonts w:ascii="Bookman Old Style" w:eastAsia="Times New Roman" w:hAnsi="Bookman Old Style" w:cstheme="minorHAnsi"/>
+          <w:color w:val="5B9BD5" w:themeColor="accent5"/>
+          <w:kern w:val="0"/>
+          <w14:ligatures w14:val="none"/>
+        </w:rPr>
+        <w:t>and will not change his mind,</w:t>
+      </w:r>
+      <w:r>
+        <w:rPr>
+          <w:rFonts w:ascii="Bookman Old Style" w:eastAsia="Times New Roman" w:hAnsi="Bookman Old Style" w:cstheme="minorHAnsi"/>
+          <w:color w:val="5B9BD5" w:themeColor="accent5"/>
+          <w:kern w:val="0"/>
+          <w14:ligatures w14:val="none"/>
+        </w:rPr>
+        <w:br/>
+      </w:r>
+      <w:r>
+        <w:rPr>
+          <w:rFonts w:ascii="Bookman Old Style" w:eastAsia="Times New Roman" w:hAnsi="Bookman Old Style" w:cstheme="minorHAnsi"/>
+          <w:color w:val="5B9BD5" w:themeColor="accent5"/>
+          <w:kern w:val="0"/>
+          <w14:ligatures w14:val="none"/>
+        </w:rPr>
+        <w:t>“You are a priest forever</w:t>
+      </w:r>
+      <w:r>
+        <w:rPr>
+          <w:rFonts w:ascii="Bookman Old Style" w:eastAsia="Times New Roman" w:hAnsi="Bookman Old Style" w:cstheme="minorHAnsi"/>
+          <w:color w:val="5B9BD5" w:themeColor="accent5"/>
+          <w:kern w:val="0"/>
+          <w14:ligatures w14:val="none"/>
+        </w:rPr>
+        <w:br/>
+      </w:r>
+      <w:r>
+        <w:rPr>
+          <w:rFonts w:ascii="Bookman Old Style" w:eastAsia="Times New Roman" w:hAnsi="Bookman Old Style" w:cstheme="minorHAnsi"/>
+          <w:color w:val="5B9BD5" w:themeColor="accent5"/>
+          <w:kern w:val="0"/>
+          <w14:ligatures w14:val="none"/>
+        </w:rPr>
+        <w:t>after the order of Melchizedek.”</w:t>
       </w:r>
     </w:p>
     <w:p>
@@ -665,21 +699,58 @@
       <w:pPr>
         <w:rPr>
           <w:rFonts w:ascii="Bookman Old Style" w:eastAsia="Times New Roman" w:hAnsi="Bookman Old Style" w:cs="Times New Roman"/>
-          <w:i/>
-          <w:iCs/>
-          <w:kern w:val="0"/>
-          <w14:ligatures w14:val="none"/>
-        </w:rPr>
-      </w:pPr>
-      <w:r>
-        <w:rPr>
-          <w:rFonts w:ascii="Bookman Old Style" w:eastAsia="Times New Roman" w:hAnsi="Bookman Old Style" w:cs="Times New Roman"/>
-          <w:i/>
-          <w:iCs/>
-          <w:kern w:val="0"/>
-          <w14:ligatures w14:val="none"/>
-        </w:rPr>
-        <w:t>Read verses 8-16</w:t>
+          <w:color w:val="5B9BD5" w:themeColor="accent5"/>
+          <w:kern w:val="0"/>
+          <w14:ligatures w14:val="none"/>
+        </w:rPr>
+      </w:pPr>
+      <w:r>
+        <w:rPr>
+          <w:rFonts w:ascii="Bookman Old Style" w:eastAsia="Times New Roman" w:hAnsi="Bookman Old Style" w:cs="Times New Roman"/>
+          <w:color w:val="5B9BD5" w:themeColor="accent5"/>
+          <w:kern w:val="0"/>
+          <w14:ligatures w14:val="none"/>
+        </w:rPr>
+        <w:t>Then the king of Sodom, the king of Gomorrah, the king of Admah, the king of Zeboiim, and the king of Bela (that is, Zoar) went out, and they joined battle in the Valley of Siddim with Chedorlaomer king of Elam, Tidal king of Goiim, Amraphel king of Shinar, and Arioch king of Ellasar, four kings against five. Now the Valley of Siddim was full of bitumen pits, and as the kings of Sodom and Gomorrah fled, some fell into them, and the rest fled to the hill country. </w:t>
+      </w:r>
+      <w:proofErr w:type="gramStart"/>
+      <w:r>
+        <w:rPr>
+          <w:rFonts w:ascii="Bookman Old Style" w:eastAsia="Times New Roman" w:hAnsi="Bookman Old Style" w:cs="Times New Roman"/>
+          <w:color w:val="5B9BD5" w:themeColor="accent5"/>
+          <w:kern w:val="0"/>
+          <w14:ligatures w14:val="none"/>
+        </w:rPr>
+        <w:t>So</w:t>
+      </w:r>
+      <w:proofErr w:type="gramEnd"/>
+      <w:r>
+        <w:rPr>
+          <w:rFonts w:ascii="Bookman Old Style" w:eastAsia="Times New Roman" w:hAnsi="Bookman Old Style" w:cs="Times New Roman"/>
+          <w:color w:val="5B9BD5" w:themeColor="accent5"/>
+          <w:kern w:val="0"/>
+          <w14:ligatures w14:val="none"/>
+        </w:rPr>
+        <w:t xml:space="preserve"> the enemy took all the possessions of Sodom and Gomorrah, and all their provisions, and went their way. They also took Lot, the son of Abram’s brother, who was dwelling in Sodom, and his possessions, and went their way. </w:t>
+      </w:r>
+    </w:p>
+    <w:p>
+      <w:pPr>
+        <w:rPr>
+          <w:rFonts w:ascii="Bookman Old Style" w:eastAsia="Times New Roman" w:hAnsi="Bookman Old Style" w:cs="Times New Roman"/>
+          <w:color w:val="5B9BD5" w:themeColor="accent5"/>
+          <w:kern w:val="0"/>
+          <w14:ligatures w14:val="none"/>
+        </w:rPr>
+      </w:pPr>
+      <w:r>
+        <w:rPr>
+          <w:rFonts w:ascii="Bookman Old Style" w:eastAsia="Times New Roman" w:hAnsi="Bookman Old Style" w:cs="Times New Roman"/>
+          <w:color w:val="5B9BD5" w:themeColor="accent5"/>
+          <w:kern w:val="0"/>
+          <w14:ligatures w14:val="none"/>
+        </w:rPr>
+        <w:t>Then one who had escaped came and told Abram the Hebrew, who was living by the oaks of Mamre the Amorite, brother of Eshcol and of Aner. These were allies of Abram. When Abram heard that his kinsman had been taken captive, he led forth his trained men, born in his house, 318 of them, and went in pursuit as far as Dan. And he divided his forces against them by night, he and his servants, and defeated them and pursued them to Hobah, north of Damascus. Then he brought back all the possessions, and also brought back his kinsman Lot with his possessions, and the women and the people.</w:t>
       </w:r>
     </w:p>
     <w:p>
@@ -714,6 +785,7 @@
           <w:kern w:val="0"/>
           <w14:ligatures w14:val="none"/>
         </w:rPr>
+        <w:lastRenderedPageBreak/>
         <w:t>V</w:t>
       </w:r>
       <w:r>
@@ -1083,6 +1155,229 @@
           <w14:ligatures w14:val="none"/>
         </w:rPr>
         <w:br/>
+        <w:t>That kind of dual</w:t>
+      </w:r>
+      <w:r>
+        <w:rPr>
+          <w:rFonts w:ascii="Bookman Old Style" w:eastAsia="Times New Roman" w:hAnsi="Bookman Old Style" w:cs="Times New Roman"/>
+          <w:kern w:val="0"/>
+          <w14:ligatures w14:val="none"/>
+        </w:rPr>
+        <w:t xml:space="preserve"> political and spiritual leadership role was not an established pattern in the Old Testament times.</w:t>
+      </w:r>
+    </w:p>
+    <w:p>
+      <w:pPr>
+        <w:rPr>
+          <w:rFonts w:ascii="Bookman Old Style" w:eastAsia="Times New Roman" w:hAnsi="Bookman Old Style" w:cs="Times New Roman"/>
+          <w:kern w:val="0"/>
+          <w14:ligatures w14:val="none"/>
+        </w:rPr>
+      </w:pPr>
+      <w:r>
+        <w:rPr>
+          <w:rFonts w:ascii="Bookman Old Style" w:eastAsia="Times New Roman" w:hAnsi="Bookman Old Style" w:cs="Times New Roman"/>
+          <w:kern w:val="0"/>
+          <w14:ligatures w14:val="none"/>
+        </w:rPr>
+        <w:t>Now, listen to verses 17-18</w:t>
+      </w:r>
+      <w:r>
+        <w:rPr>
+          <w:rFonts w:ascii="Bookman Old Style" w:eastAsia="Times New Roman" w:hAnsi="Bookman Old Style" w:cs="Times New Roman"/>
+          <w:kern w:val="0"/>
+          <w14:ligatures w14:val="none"/>
+        </w:rPr>
+        <w:t>.</w:t>
+      </w:r>
+    </w:p>
+    <w:p>
+      <w:pPr>
+        <w:rPr>
+          <w:rFonts w:ascii="Bookman Old Style" w:eastAsia="Times New Roman" w:hAnsi="Bookman Old Style" w:cs="Times New Roman"/>
+          <w:color w:val="5B9BD5" w:themeColor="accent5"/>
+          <w:kern w:val="0"/>
+          <w14:ligatures w14:val="none"/>
+        </w:rPr>
+      </w:pPr>
+      <w:r>
+        <w:rPr>
+          <w:rFonts w:ascii="Bookman Old Style" w:eastAsia="Times New Roman" w:hAnsi="Bookman Old Style" w:cs="Times New Roman"/>
+          <w:color w:val="5B9BD5" w:themeColor="accent5"/>
+          <w:kern w:val="0"/>
+          <w14:ligatures w14:val="none"/>
+        </w:rPr>
+        <w:t>After his return from the defeat of Chedorlaomer and the kings who were with him, the king of Sodom went out to meet him at the Valley of Shaveh (that is, the King’s Valley). And Melchizedek king of Salem brought out bread and wine. (He was priest of God Most High.)</w:t>
+      </w:r>
+    </w:p>
+    <w:p>
+      <w:pPr>
+        <w:rPr>
+          <w:rFonts w:ascii="Bookman Old Style" w:eastAsia="Times New Roman" w:hAnsi="Bookman Old Style" w:cs="Times New Roman"/>
+          <w:kern w:val="0"/>
+          <w14:ligatures w14:val="none"/>
+        </w:rPr>
+      </w:pPr>
+      <w:r>
+        <w:rPr>
+          <w:rFonts w:ascii="Bookman Old Style" w:eastAsia="Times New Roman" w:hAnsi="Bookman Old Style" w:cs="Times New Roman"/>
+          <w:kern w:val="0"/>
+          <w14:ligatures w14:val="none"/>
+        </w:rPr>
+        <w:t xml:space="preserve">So, </w:t>
+      </w:r>
+      <w:r>
+        <w:rPr>
+          <w:rFonts w:ascii="Bookman Old Style" w:eastAsia="Times New Roman" w:hAnsi="Bookman Old Style" w:cs="Times New Roman"/>
+          <w:kern w:val="0"/>
+          <w14:ligatures w14:val="none"/>
+        </w:rPr>
+        <w:t>Abram returns</w:t>
+      </w:r>
+      <w:r>
+        <w:rPr>
+          <w:rFonts w:ascii="Bookman Old Style" w:eastAsia="Times New Roman" w:hAnsi="Bookman Old Style" w:cs="Times New Roman"/>
+          <w:kern w:val="0"/>
+          <w14:ligatures w14:val="none"/>
+        </w:rPr>
+        <w:t xml:space="preserve"> victorious</w:t>
+      </w:r>
+      <w:r>
+        <w:rPr>
+          <w:rFonts w:ascii="Bookman Old Style" w:eastAsia="Times New Roman" w:hAnsi="Bookman Old Style" w:cs="Times New Roman"/>
+          <w:kern w:val="0"/>
+          <w14:ligatures w14:val="none"/>
+        </w:rPr>
+        <w:t>, greeted by two kings:</w:t>
+      </w:r>
+    </w:p>
+    <w:p>
+      <w:pPr>
+        <w:rPr>
+          <w:rFonts w:ascii="Bookman Old Style" w:eastAsia="Times New Roman" w:hAnsi="Bookman Old Style" w:cs="Times New Roman"/>
+          <w:kern w:val="0"/>
+          <w14:ligatures w14:val="none"/>
+        </w:rPr>
+      </w:pPr>
+      <w:r>
+        <w:rPr>
+          <w:rFonts w:ascii="Bookman Old Style" w:eastAsia="Times New Roman" w:hAnsi="Bookman Old Style" w:cs="Times New Roman"/>
+          <w:kern w:val="0"/>
+          <w14:ligatures w14:val="none"/>
+        </w:rPr>
+        <w:t>The f</w:t>
+      </w:r>
+      <w:r>
+        <w:rPr>
+          <w:rFonts w:ascii="Bookman Old Style" w:eastAsia="Times New Roman" w:hAnsi="Bookman Old Style" w:cs="Times New Roman"/>
+          <w:kern w:val="0"/>
+          <w14:ligatures w14:val="none"/>
+        </w:rPr>
+        <w:t>irst mentioned is the king of Sodom.</w:t>
+      </w:r>
+    </w:p>
+    <w:p>
+      <w:pPr>
+        <w:rPr>
+          <w:rFonts w:ascii="Bookman Old Style" w:eastAsia="Times New Roman" w:hAnsi="Bookman Old Style" w:cs="Times New Roman"/>
+          <w:kern w:val="0"/>
+          <w14:ligatures w14:val="none"/>
+        </w:rPr>
+      </w:pPr>
+      <w:r>
+        <w:rPr>
+          <w:rFonts w:ascii="Bookman Old Style" w:eastAsia="Times New Roman" w:hAnsi="Bookman Old Style" w:cs="Times New Roman"/>
+          <w:kern w:val="0"/>
+          <w14:ligatures w14:val="none"/>
+        </w:rPr>
+        <w:t>The s</w:t>
+      </w:r>
+      <w:r>
+        <w:rPr>
+          <w:rFonts w:ascii="Bookman Old Style" w:eastAsia="Times New Roman" w:hAnsi="Bookman Old Style" w:cs="Times New Roman"/>
+          <w:kern w:val="0"/>
+          <w14:ligatures w14:val="none"/>
+        </w:rPr>
+        <w:t>econd is Melchizedek, king of Salem —</w:t>
+      </w:r>
+      <w:r>
+        <w:rPr>
+          <w:rFonts w:ascii="Bookman Old Style" w:eastAsia="Times New Roman" w:hAnsi="Bookman Old Style" w:cs="Times New Roman"/>
+          <w:kern w:val="0"/>
+          <w14:ligatures w14:val="none"/>
+        </w:rPr>
+        <w:br/>
+        <w:t>priest of God Most High.</w:t>
+      </w:r>
+      <w:r>
+        <w:rPr>
+          <w:rFonts w:ascii="Bookman Old Style" w:eastAsia="Times New Roman" w:hAnsi="Bookman Old Style" w:cs="Times New Roman"/>
+          <w:kern w:val="0"/>
+          <w14:ligatures w14:val="none"/>
+        </w:rPr>
+        <w:br/>
+        <w:t>He brings out bread and wine,</w:t>
+      </w:r>
+      <w:r>
+        <w:rPr>
+          <w:rFonts w:ascii="Bookman Old Style" w:eastAsia="Times New Roman" w:hAnsi="Bookman Old Style" w:cs="Times New Roman"/>
+          <w:kern w:val="0"/>
+          <w14:ligatures w14:val="none"/>
+        </w:rPr>
+        <w:br/>
+        <w:t>foreshadowing communion</w:t>
+      </w:r>
+      <w:r>
+        <w:rPr>
+          <w:rFonts w:ascii="Bookman Old Style" w:eastAsia="Times New Roman" w:hAnsi="Bookman Old Style" w:cs="Times New Roman"/>
+          <w:kern w:val="0"/>
+          <w14:ligatures w14:val="none"/>
+        </w:rPr>
+        <w:br/>
+        <w:t>due to him serving as a typology,</w:t>
+      </w:r>
+      <w:r>
+        <w:rPr>
+          <w:rFonts w:ascii="Bookman Old Style" w:eastAsia="Times New Roman" w:hAnsi="Bookman Old Style" w:cs="Times New Roman"/>
+          <w:kern w:val="0"/>
+          <w14:ligatures w14:val="none"/>
+        </w:rPr>
+        <w:br/>
+        <w:t>or a representative figure of Christ.</w:t>
+      </w:r>
+    </w:p>
+    <w:p>
+      <w:pPr>
+        <w:rPr>
+          <w:rFonts w:ascii="Bookman Old Style" w:eastAsia="Times New Roman" w:hAnsi="Bookman Old Style" w:cs="Times New Roman"/>
+          <w:kern w:val="0"/>
+          <w14:ligatures w14:val="none"/>
+        </w:rPr>
+      </w:pPr>
+      <w:r>
+        <w:rPr>
+          <w:rFonts w:ascii="Bookman Old Style" w:eastAsia="Times New Roman" w:hAnsi="Bookman Old Style" w:cs="Times New Roman"/>
+          <w:kern w:val="0"/>
+          <w14:ligatures w14:val="none"/>
+        </w:rPr>
+        <w:t>Up to this point in Genesis,</w:t>
+      </w:r>
+      <w:r>
+        <w:rPr>
+          <w:rFonts w:ascii="Bookman Old Style" w:eastAsia="Times New Roman" w:hAnsi="Bookman Old Style" w:cs="Times New Roman"/>
+          <w:kern w:val="0"/>
+          <w14:ligatures w14:val="none"/>
+        </w:rPr>
+        <w:br/>
+        <w:t>it seems every major character has a genealogy,</w:t>
+      </w:r>
+      <w:r>
+        <w:rPr>
+          <w:rFonts w:ascii="Bookman Old Style" w:eastAsia="Times New Roman" w:hAnsi="Bookman Old Style" w:cs="Times New Roman"/>
+          <w:kern w:val="0"/>
+          <w14:ligatures w14:val="none"/>
+        </w:rPr>
+        <w:br/>
       </w:r>
       <w:r>
         <w:rPr>
@@ -1091,231 +1386,6 @@
           <w14:ligatures w14:val="none"/>
         </w:rPr>
         <w:lastRenderedPageBreak/>
-        <w:t>That kind of dual</w:t>
-      </w:r>
-      <w:r>
-        <w:rPr>
-          <w:rFonts w:ascii="Bookman Old Style" w:eastAsia="Times New Roman" w:hAnsi="Bookman Old Style" w:cs="Times New Roman"/>
-          <w:kern w:val="0"/>
-          <w14:ligatures w14:val="none"/>
-        </w:rPr>
-        <w:t xml:space="preserve"> political and spiritual leadership role was not an established pattern in the Old Testament times.</w:t>
-      </w:r>
-    </w:p>
-    <w:p>
-      <w:pPr>
-        <w:rPr>
-          <w:rFonts w:ascii="Bookman Old Style" w:eastAsia="Times New Roman" w:hAnsi="Bookman Old Style" w:cs="Times New Roman"/>
-          <w:kern w:val="0"/>
-          <w14:ligatures w14:val="none"/>
-        </w:rPr>
-      </w:pPr>
-      <w:r>
-        <w:rPr>
-          <w:rFonts w:ascii="Bookman Old Style" w:eastAsia="Times New Roman" w:hAnsi="Bookman Old Style" w:cs="Times New Roman"/>
-          <w:kern w:val="0"/>
-          <w14:ligatures w14:val="none"/>
-        </w:rPr>
-        <w:t>Now, listen to verses 17-18</w:t>
-      </w:r>
-      <w:r>
-        <w:rPr>
-          <w:rFonts w:ascii="Bookman Old Style" w:eastAsia="Times New Roman" w:hAnsi="Bookman Old Style" w:cs="Times New Roman"/>
-          <w:kern w:val="0"/>
-          <w14:ligatures w14:val="none"/>
-        </w:rPr>
-        <w:t>.</w:t>
-      </w:r>
-    </w:p>
-    <w:p>
-      <w:pPr>
-        <w:rPr>
-          <w:rFonts w:ascii="Bookman Old Style" w:eastAsia="Times New Roman" w:hAnsi="Bookman Old Style" w:cs="Times New Roman"/>
-          <w:i/>
-          <w:iCs/>
-          <w:kern w:val="0"/>
-          <w14:ligatures w14:val="none"/>
-        </w:rPr>
-      </w:pPr>
-      <w:r>
-        <w:rPr>
-          <w:rFonts w:ascii="Bookman Old Style" w:eastAsia="Times New Roman" w:hAnsi="Bookman Old Style" w:cs="Times New Roman"/>
-          <w:i/>
-          <w:iCs/>
-          <w:kern w:val="0"/>
-          <w14:ligatures w14:val="none"/>
-        </w:rPr>
-        <w:t>Read verse 17-18</w:t>
-      </w:r>
-    </w:p>
-    <w:p>
-      <w:pPr>
-        <w:rPr>
-          <w:rFonts w:ascii="Bookman Old Style" w:eastAsia="Times New Roman" w:hAnsi="Bookman Old Style" w:cs="Times New Roman"/>
-          <w:kern w:val="0"/>
-          <w14:ligatures w14:val="none"/>
-        </w:rPr>
-      </w:pPr>
-      <w:r>
-        <w:rPr>
-          <w:rFonts w:ascii="Bookman Old Style" w:eastAsia="Times New Roman" w:hAnsi="Bookman Old Style" w:cs="Times New Roman"/>
-          <w:kern w:val="0"/>
-          <w14:ligatures w14:val="none"/>
-        </w:rPr>
-        <w:t xml:space="preserve">So, </w:t>
-      </w:r>
-      <w:r>
-        <w:rPr>
-          <w:rFonts w:ascii="Bookman Old Style" w:eastAsia="Times New Roman" w:hAnsi="Bookman Old Style" w:cs="Times New Roman"/>
-          <w:kern w:val="0"/>
-          <w14:ligatures w14:val="none"/>
-        </w:rPr>
-        <w:t>Abram returns</w:t>
-      </w:r>
-      <w:r>
-        <w:rPr>
-          <w:rFonts w:ascii="Bookman Old Style" w:eastAsia="Times New Roman" w:hAnsi="Bookman Old Style" w:cs="Times New Roman"/>
-          <w:kern w:val="0"/>
-          <w14:ligatures w14:val="none"/>
-        </w:rPr>
-        <w:t xml:space="preserve"> victorious</w:t>
-      </w:r>
-      <w:r>
-        <w:rPr>
-          <w:rFonts w:ascii="Bookman Old Style" w:eastAsia="Times New Roman" w:hAnsi="Bookman Old Style" w:cs="Times New Roman"/>
-          <w:kern w:val="0"/>
-          <w14:ligatures w14:val="none"/>
-        </w:rPr>
-        <w:t>, greeted by two kings:</w:t>
-      </w:r>
-    </w:p>
-    <w:p>
-      <w:pPr>
-        <w:rPr>
-          <w:rFonts w:ascii="Bookman Old Style" w:eastAsia="Times New Roman" w:hAnsi="Bookman Old Style" w:cs="Times New Roman"/>
-          <w:kern w:val="0"/>
-          <w14:ligatures w14:val="none"/>
-        </w:rPr>
-      </w:pPr>
-      <w:r>
-        <w:rPr>
-          <w:rFonts w:ascii="Bookman Old Style" w:eastAsia="Times New Roman" w:hAnsi="Bookman Old Style" w:cs="Times New Roman"/>
-          <w:kern w:val="0"/>
-          <w14:ligatures w14:val="none"/>
-        </w:rPr>
-        <w:t>The f</w:t>
-      </w:r>
-      <w:r>
-        <w:rPr>
-          <w:rFonts w:ascii="Bookman Old Style" w:eastAsia="Times New Roman" w:hAnsi="Bookman Old Style" w:cs="Times New Roman"/>
-          <w:kern w:val="0"/>
-          <w14:ligatures w14:val="none"/>
-        </w:rPr>
-        <w:t>irst mentioned is the king of Sodom.</w:t>
-      </w:r>
-    </w:p>
-    <w:p>
-      <w:pPr>
-        <w:rPr>
-          <w:rFonts w:ascii="Bookman Old Style" w:eastAsia="Times New Roman" w:hAnsi="Bookman Old Style" w:cs="Times New Roman"/>
-          <w:kern w:val="0"/>
-          <w14:ligatures w14:val="none"/>
-        </w:rPr>
-      </w:pPr>
-      <w:r>
-        <w:rPr>
-          <w:rFonts w:ascii="Bookman Old Style" w:eastAsia="Times New Roman" w:hAnsi="Bookman Old Style" w:cs="Times New Roman"/>
-          <w:kern w:val="0"/>
-          <w14:ligatures w14:val="none"/>
-        </w:rPr>
-        <w:t>The s</w:t>
-      </w:r>
-      <w:r>
-        <w:rPr>
-          <w:rFonts w:ascii="Bookman Old Style" w:eastAsia="Times New Roman" w:hAnsi="Bookman Old Style" w:cs="Times New Roman"/>
-          <w:kern w:val="0"/>
-          <w14:ligatures w14:val="none"/>
-        </w:rPr>
-        <w:t>econd is Melchizedek, king of Salem —</w:t>
-      </w:r>
-      <w:r>
-        <w:rPr>
-          <w:rFonts w:ascii="Bookman Old Style" w:eastAsia="Times New Roman" w:hAnsi="Bookman Old Style" w:cs="Times New Roman"/>
-          <w:kern w:val="0"/>
-          <w14:ligatures w14:val="none"/>
-        </w:rPr>
-        <w:br/>
-        <w:t>priest of God Most High.</w:t>
-      </w:r>
-      <w:r>
-        <w:rPr>
-          <w:rFonts w:ascii="Bookman Old Style" w:eastAsia="Times New Roman" w:hAnsi="Bookman Old Style" w:cs="Times New Roman"/>
-          <w:kern w:val="0"/>
-          <w14:ligatures w14:val="none"/>
-        </w:rPr>
-        <w:br/>
-        <w:t>He brings out bread and wine,</w:t>
-      </w:r>
-      <w:r>
-        <w:rPr>
-          <w:rFonts w:ascii="Bookman Old Style" w:eastAsia="Times New Roman" w:hAnsi="Bookman Old Style" w:cs="Times New Roman"/>
-          <w:kern w:val="0"/>
-          <w14:ligatures w14:val="none"/>
-        </w:rPr>
-        <w:br/>
-        <w:t>foreshadowing communion</w:t>
-      </w:r>
-      <w:r>
-        <w:rPr>
-          <w:rFonts w:ascii="Bookman Old Style" w:eastAsia="Times New Roman" w:hAnsi="Bookman Old Style" w:cs="Times New Roman"/>
-          <w:kern w:val="0"/>
-          <w14:ligatures w14:val="none"/>
-        </w:rPr>
-        <w:br/>
-        <w:t>due to him serving as a typology,</w:t>
-      </w:r>
-      <w:r>
-        <w:rPr>
-          <w:rFonts w:ascii="Bookman Old Style" w:eastAsia="Times New Roman" w:hAnsi="Bookman Old Style" w:cs="Times New Roman"/>
-          <w:kern w:val="0"/>
-          <w14:ligatures w14:val="none"/>
-        </w:rPr>
-        <w:br/>
-        <w:t>or a representative figure of Christ.</w:t>
-      </w:r>
-    </w:p>
-    <w:p>
-      <w:pPr>
-        <w:rPr>
-          <w:rFonts w:ascii="Bookman Old Style" w:eastAsia="Times New Roman" w:hAnsi="Bookman Old Style" w:cs="Times New Roman"/>
-          <w:kern w:val="0"/>
-          <w14:ligatures w14:val="none"/>
-        </w:rPr>
-      </w:pPr>
-      <w:r>
-        <w:rPr>
-          <w:rFonts w:ascii="Bookman Old Style" w:eastAsia="Times New Roman" w:hAnsi="Bookman Old Style" w:cs="Times New Roman"/>
-          <w:kern w:val="0"/>
-          <w14:ligatures w14:val="none"/>
-        </w:rPr>
-        <w:t>Up to this point in Genesis,</w:t>
-      </w:r>
-      <w:r>
-        <w:rPr>
-          <w:rFonts w:ascii="Bookman Old Style" w:eastAsia="Times New Roman" w:hAnsi="Bookman Old Style" w:cs="Times New Roman"/>
-          <w:kern w:val="0"/>
-          <w14:ligatures w14:val="none"/>
-        </w:rPr>
-        <w:br/>
-        <w:t>it seems every major character has a genealogy,</w:t>
-      </w:r>
-      <w:r>
-        <w:rPr>
-          <w:rFonts w:ascii="Bookman Old Style" w:eastAsia="Times New Roman" w:hAnsi="Bookman Old Style" w:cs="Times New Roman"/>
-          <w:kern w:val="0"/>
-          <w14:ligatures w14:val="none"/>
-        </w:rPr>
-        <w:br/>
         <w:t>or at least a father named,</w:t>
       </w:r>
       <w:r>
@@ -1541,19 +1611,113 @@
       <w:pPr>
         <w:rPr>
           <w:rFonts w:ascii="Bookman Old Style" w:eastAsia="Times New Roman" w:hAnsi="Bookman Old Style" w:cs="Times New Roman"/>
-          <w:kern w:val="0"/>
-          <w14:ligatures w14:val="none"/>
-        </w:rPr>
-      </w:pPr>
-      <w:r>
-        <w:rPr>
-          <w:rFonts w:ascii="Bookman Old Style" w:eastAsia="Times New Roman" w:hAnsi="Bookman Old Style" w:cs="Times New Roman"/>
-          <w:i/>
-          <w:iCs/>
-          <w:kern w:val="0"/>
-          <w14:ligatures w14:val="none"/>
-        </w:rPr>
-        <w:t>Read verses 19-20</w:t>
+          <w:color w:val="5B9BD5" w:themeColor="accent5"/>
+          <w:kern w:val="0"/>
+          <w14:ligatures w14:val="none"/>
+        </w:rPr>
+      </w:pPr>
+      <w:r>
+        <w:rPr>
+          <w:rFonts w:ascii="Bookman Old Style" w:eastAsia="Times New Roman" w:hAnsi="Bookman Old Style" w:cs="Times New Roman"/>
+          <w:color w:val="5B9BD5" w:themeColor="accent5"/>
+          <w:kern w:val="0"/>
+          <w14:ligatures w14:val="none"/>
+        </w:rPr>
+        <w:t>And he blessed him and said,</w:t>
+      </w:r>
+    </w:p>
+    <w:p>
+      <w:pPr>
+        <w:rPr>
+          <w:rFonts w:ascii="Bookman Old Style" w:eastAsia="Times New Roman" w:hAnsi="Bookman Old Style" w:cs="Times New Roman"/>
+          <w:color w:val="5B9BD5" w:themeColor="accent5"/>
+          <w:kern w:val="0"/>
+          <w14:ligatures w14:val="none"/>
+        </w:rPr>
+      </w:pPr>
+      <w:r>
+        <w:rPr>
+          <w:rFonts w:ascii="Bookman Old Style" w:eastAsia="Times New Roman" w:hAnsi="Bookman Old Style" w:cs="Times New Roman"/>
+          <w:color w:val="5B9BD5" w:themeColor="accent5"/>
+          <w:kern w:val="0"/>
+          <w14:ligatures w14:val="none"/>
+        </w:rPr>
+        <w:t>“Blessed be Abram by God Most High,</w:t>
+      </w:r>
+      <w:r>
+        <w:rPr>
+          <w:rFonts w:ascii="Bookman Old Style" w:eastAsia="Times New Roman" w:hAnsi="Bookman Old Style" w:cs="Times New Roman"/>
+          <w:color w:val="5B9BD5" w:themeColor="accent5"/>
+          <w:kern w:val="0"/>
+          <w14:ligatures w14:val="none"/>
+        </w:rPr>
+        <w:br/>
+        <w:t xml:space="preserve">          </w:t>
+      </w:r>
+      <w:r>
+        <w:rPr>
+          <w:rFonts w:ascii="Bookman Old Style" w:eastAsia="Times New Roman" w:hAnsi="Bookman Old Style" w:cs="Times New Roman"/>
+          <w:color w:val="5B9BD5" w:themeColor="accent5"/>
+          <w:kern w:val="0"/>
+          <w14:ligatures w14:val="none"/>
+        </w:rPr>
+        <w:t>Possessor of heaven and earth;</w:t>
+      </w:r>
+      <w:r>
+        <w:rPr>
+          <w:rFonts w:ascii="Bookman Old Style" w:eastAsia="Times New Roman" w:hAnsi="Bookman Old Style" w:cs="Times New Roman"/>
+          <w:color w:val="5B9BD5" w:themeColor="accent5"/>
+          <w:kern w:val="0"/>
+          <w14:ligatures w14:val="none"/>
+        </w:rPr>
+        <w:br/>
+      </w:r>
+      <w:r>
+        <w:rPr>
+          <w:rFonts w:ascii="Bookman Old Style" w:eastAsia="Times New Roman" w:hAnsi="Bookman Old Style" w:cs="Times New Roman"/>
+          <w:color w:val="5B9BD5" w:themeColor="accent5"/>
+          <w:kern w:val="0"/>
+          <w14:ligatures w14:val="none"/>
+        </w:rPr>
+        <w:t>and blessed be God Most High,</w:t>
+      </w:r>
+      <w:r>
+        <w:rPr>
+          <w:rFonts w:ascii="Bookman Old Style" w:eastAsia="Times New Roman" w:hAnsi="Bookman Old Style" w:cs="Times New Roman"/>
+          <w:color w:val="5B9BD5" w:themeColor="accent5"/>
+          <w:kern w:val="0"/>
+          <w14:ligatures w14:val="none"/>
+        </w:rPr>
+        <w:br/>
+        <w:t xml:space="preserve">          </w:t>
+      </w:r>
+      <w:r>
+        <w:rPr>
+          <w:rFonts w:ascii="Bookman Old Style" w:eastAsia="Times New Roman" w:hAnsi="Bookman Old Style" w:cs="Times New Roman"/>
+          <w:color w:val="5B9BD5" w:themeColor="accent5"/>
+          <w:kern w:val="0"/>
+          <w14:ligatures w14:val="none"/>
+        </w:rPr>
+        <w:t>who has delivered your enemies into your hand!”</w:t>
+      </w:r>
+    </w:p>
+    <w:p>
+      <w:pPr>
+        <w:rPr>
+          <w:rFonts w:ascii="Bookman Old Style" w:eastAsia="Times New Roman" w:hAnsi="Bookman Old Style" w:cs="Times New Roman"/>
+          <w:color w:val="5B9BD5" w:themeColor="accent5"/>
+          <w:kern w:val="0"/>
+          <w14:ligatures w14:val="none"/>
+        </w:rPr>
+      </w:pPr>
+      <w:r>
+        <w:rPr>
+          <w:rFonts w:ascii="Bookman Old Style" w:eastAsia="Times New Roman" w:hAnsi="Bookman Old Style" w:cs="Times New Roman"/>
+          <w:color w:val="5B9BD5" w:themeColor="accent5"/>
+          <w:kern w:val="0"/>
+          <w14:ligatures w14:val="none"/>
+        </w:rPr>
+        <w:t>And Abram gave him a tenth of everything.</w:t>
       </w:r>
     </w:p>
     <w:p>
@@ -1675,152 +1839,159 @@
           <w:kern w:val="0"/>
           <w14:ligatures w14:val="none"/>
         </w:rPr>
+        <w:t>“Abram gave him a tenth of everything”</w:t>
+      </w:r>
+      <w:r>
+        <w:rPr>
+          <w:rFonts w:ascii="Bookman Old Style" w:eastAsia="Times New Roman" w:hAnsi="Bookman Old Style" w:cs="Times New Roman"/>
+          <w:kern w:val="0"/>
+          <w14:ligatures w14:val="none"/>
+        </w:rPr>
+        <w:br/>
+        <w:t>a symbolic confession that success belongs to the LORD</w:t>
+      </w:r>
+      <w:r>
+        <w:rPr>
+          <w:rFonts w:ascii="Bookman Old Style" w:eastAsia="Times New Roman" w:hAnsi="Bookman Old Style" w:cs="Times New Roman"/>
+          <w:kern w:val="0"/>
+          <w14:ligatures w14:val="none"/>
+        </w:rPr>
+        <w:t>,</w:t>
+      </w:r>
+      <w:r>
+        <w:rPr>
+          <w:rFonts w:ascii="Bookman Old Style" w:eastAsia="Times New Roman" w:hAnsi="Bookman Old Style" w:cs="Times New Roman"/>
+          <w:kern w:val="0"/>
+          <w14:ligatures w14:val="none"/>
+        </w:rPr>
+        <w:br/>
+        <w:t>as Melchizedek indicated in verse 20.</w:t>
+      </w:r>
+      <w:r>
+        <w:rPr>
+          <w:rFonts w:ascii="Bookman Old Style" w:eastAsia="Times New Roman" w:hAnsi="Bookman Old Style" w:cs="Times New Roman"/>
+          <w:kern w:val="0"/>
+          <w14:ligatures w14:val="none"/>
+        </w:rPr>
+        <w:br/>
+      </w:r>
+      <w:r>
+        <w:rPr>
+          <w:rFonts w:ascii="Bookman Old Style" w:eastAsia="Times New Roman" w:hAnsi="Bookman Old Style" w:cs="Times New Roman"/>
+          <w:kern w:val="0"/>
+          <w14:ligatures w14:val="none"/>
+        </w:rPr>
+        <w:t xml:space="preserve">It also </w:t>
+      </w:r>
+      <w:r>
+        <w:rPr>
+          <w:rFonts w:ascii="Bookman Old Style" w:eastAsia="Times New Roman" w:hAnsi="Bookman Old Style" w:cs="Times New Roman"/>
+          <w:kern w:val="0"/>
+          <w14:ligatures w14:val="none"/>
+        </w:rPr>
+        <w:t>foreshadow</w:t>
+      </w:r>
+      <w:r>
+        <w:rPr>
+          <w:rFonts w:ascii="Bookman Old Style" w:eastAsia="Times New Roman" w:hAnsi="Bookman Old Style" w:cs="Times New Roman"/>
+          <w:kern w:val="0"/>
+          <w14:ligatures w14:val="none"/>
+        </w:rPr>
+        <w:t>s</w:t>
+      </w:r>
+      <w:r>
+        <w:rPr>
+          <w:rFonts w:ascii="Bookman Old Style" w:eastAsia="Times New Roman" w:hAnsi="Bookman Old Style" w:cs="Times New Roman"/>
+          <w:kern w:val="0"/>
+          <w14:ligatures w14:val="none"/>
+        </w:rPr>
+        <w:t xml:space="preserve"> the coming Mosaic Law.</w:t>
+      </w:r>
+    </w:p>
+    <w:p>
+      <w:pPr>
+        <w:rPr>
+          <w:rFonts w:ascii="Bookman Old Style" w:eastAsia="Times New Roman" w:hAnsi="Bookman Old Style" w:cs="Times New Roman"/>
+          <w:kern w:val="0"/>
+          <w14:ligatures w14:val="none"/>
+        </w:rPr>
+      </w:pPr>
+      <w:r>
+        <w:rPr>
+          <w:rFonts w:ascii="Bookman Old Style" w:eastAsia="Times New Roman" w:hAnsi="Bookman Old Style" w:cs="Times New Roman"/>
+          <w:kern w:val="0"/>
+          <w14:ligatures w14:val="none"/>
+        </w:rPr>
+        <w:t>The people of Israel would be commanded</w:t>
+      </w:r>
+      <w:r>
+        <w:rPr>
+          <w:rFonts w:ascii="Bookman Old Style" w:eastAsia="Times New Roman" w:hAnsi="Bookman Old Style" w:cs="Times New Roman"/>
+          <w:kern w:val="0"/>
+          <w14:ligatures w14:val="none"/>
+        </w:rPr>
+        <w:br/>
+        <w:t>to give one tenth of all they earned</w:t>
+      </w:r>
+      <w:r>
+        <w:rPr>
+          <w:rFonts w:ascii="Bookman Old Style" w:eastAsia="Times New Roman" w:hAnsi="Bookman Old Style" w:cs="Times New Roman"/>
+          <w:kern w:val="0"/>
+          <w14:ligatures w14:val="none"/>
+        </w:rPr>
+        <w:br/>
+        <w:t>directly to the Levitical priesthood,</w:t>
+      </w:r>
+      <w:r>
+        <w:rPr>
+          <w:rFonts w:ascii="Bookman Old Style" w:eastAsia="Times New Roman" w:hAnsi="Bookman Old Style" w:cs="Times New Roman"/>
+          <w:kern w:val="0"/>
+          <w14:ligatures w14:val="none"/>
+        </w:rPr>
+        <w:br/>
+        <w:t>indirectly to God Most High.</w:t>
+      </w:r>
+    </w:p>
+    <w:p>
+      <w:pPr>
+        <w:rPr>
+          <w:rFonts w:ascii="Bookman Old Style" w:eastAsia="Times New Roman" w:hAnsi="Bookman Old Style" w:cs="Times New Roman"/>
+          <w:kern w:val="0"/>
+          <w14:ligatures w14:val="none"/>
+        </w:rPr>
+      </w:pPr>
+      <w:r>
+        <w:rPr>
+          <w:rFonts w:ascii="Bookman Old Style" w:eastAsia="Times New Roman" w:hAnsi="Bookman Old Style" w:cs="Times New Roman"/>
+          <w:kern w:val="0"/>
+          <w14:ligatures w14:val="none"/>
+        </w:rPr>
+        <w:t>Abram demonstrates the heart of the law</w:t>
+      </w:r>
+      <w:r>
+        <w:rPr>
+          <w:rFonts w:ascii="Bookman Old Style" w:eastAsia="Times New Roman" w:hAnsi="Bookman Old Style" w:cs="Times New Roman"/>
+          <w:kern w:val="0"/>
+          <w14:ligatures w14:val="none"/>
+        </w:rPr>
+        <w:br/>
+        <w:t>400 years before the letter of the law was written.</w:t>
+      </w:r>
+      <w:r>
+        <w:rPr>
+          <w:rFonts w:ascii="Bookman Old Style" w:eastAsia="Times New Roman" w:hAnsi="Bookman Old Style" w:cs="Times New Roman"/>
+          <w:kern w:val="0"/>
+          <w14:ligatures w14:val="none"/>
+        </w:rPr>
+        <w:br/>
+      </w:r>
+      <w:r>
+        <w:rPr>
+          <w:rFonts w:ascii="Bookman Old Style" w:eastAsia="Times New Roman" w:hAnsi="Bookman Old Style" w:cs="Times New Roman"/>
+          <w:kern w:val="0"/>
+          <w14:ligatures w14:val="none"/>
+        </w:rPr>
         <w:lastRenderedPageBreak/>
-        <w:t>“Abram gave him a tenth of everything”</w:t>
-      </w:r>
-      <w:r>
-        <w:rPr>
-          <w:rFonts w:ascii="Bookman Old Style" w:eastAsia="Times New Roman" w:hAnsi="Bookman Old Style" w:cs="Times New Roman"/>
-          <w:kern w:val="0"/>
-          <w14:ligatures w14:val="none"/>
-        </w:rPr>
-        <w:br/>
-        <w:t>a symbolic confession that success belongs to the LORD</w:t>
-      </w:r>
-      <w:r>
-        <w:rPr>
-          <w:rFonts w:ascii="Bookman Old Style" w:eastAsia="Times New Roman" w:hAnsi="Bookman Old Style" w:cs="Times New Roman"/>
-          <w:kern w:val="0"/>
-          <w14:ligatures w14:val="none"/>
-        </w:rPr>
-        <w:t>,</w:t>
-      </w:r>
-      <w:r>
-        <w:rPr>
-          <w:rFonts w:ascii="Bookman Old Style" w:eastAsia="Times New Roman" w:hAnsi="Bookman Old Style" w:cs="Times New Roman"/>
-          <w:kern w:val="0"/>
-          <w14:ligatures w14:val="none"/>
-        </w:rPr>
-        <w:br/>
-        <w:t>as Melchizedek indicated in verse 20.</w:t>
-      </w:r>
-      <w:r>
-        <w:rPr>
-          <w:rFonts w:ascii="Bookman Old Style" w:eastAsia="Times New Roman" w:hAnsi="Bookman Old Style" w:cs="Times New Roman"/>
-          <w:kern w:val="0"/>
-          <w14:ligatures w14:val="none"/>
-        </w:rPr>
-        <w:br/>
-      </w:r>
-      <w:r>
-        <w:rPr>
-          <w:rFonts w:ascii="Bookman Old Style" w:eastAsia="Times New Roman" w:hAnsi="Bookman Old Style" w:cs="Times New Roman"/>
-          <w:kern w:val="0"/>
-          <w14:ligatures w14:val="none"/>
-        </w:rPr>
-        <w:t xml:space="preserve">It also </w:t>
-      </w:r>
-      <w:r>
-        <w:rPr>
-          <w:rFonts w:ascii="Bookman Old Style" w:eastAsia="Times New Roman" w:hAnsi="Bookman Old Style" w:cs="Times New Roman"/>
-          <w:kern w:val="0"/>
-          <w14:ligatures w14:val="none"/>
-        </w:rPr>
-        <w:t>foreshadow</w:t>
-      </w:r>
-      <w:r>
-        <w:rPr>
-          <w:rFonts w:ascii="Bookman Old Style" w:eastAsia="Times New Roman" w:hAnsi="Bookman Old Style" w:cs="Times New Roman"/>
-          <w:kern w:val="0"/>
-          <w14:ligatures w14:val="none"/>
-        </w:rPr>
-        <w:t>s</w:t>
-      </w:r>
-      <w:r>
-        <w:rPr>
-          <w:rFonts w:ascii="Bookman Old Style" w:eastAsia="Times New Roman" w:hAnsi="Bookman Old Style" w:cs="Times New Roman"/>
-          <w:kern w:val="0"/>
-          <w14:ligatures w14:val="none"/>
-        </w:rPr>
-        <w:t xml:space="preserve"> the coming Mosaic Law.</w:t>
-      </w:r>
-    </w:p>
-    <w:p>
-      <w:pPr>
-        <w:rPr>
-          <w:rFonts w:ascii="Bookman Old Style" w:eastAsia="Times New Roman" w:hAnsi="Bookman Old Style" w:cs="Times New Roman"/>
-          <w:kern w:val="0"/>
-          <w14:ligatures w14:val="none"/>
-        </w:rPr>
-      </w:pPr>
-      <w:r>
-        <w:rPr>
-          <w:rFonts w:ascii="Bookman Old Style" w:eastAsia="Times New Roman" w:hAnsi="Bookman Old Style" w:cs="Times New Roman"/>
-          <w:kern w:val="0"/>
-          <w14:ligatures w14:val="none"/>
-        </w:rPr>
-        <w:t>The people of Israel would be commanded</w:t>
-      </w:r>
-      <w:r>
-        <w:rPr>
-          <w:rFonts w:ascii="Bookman Old Style" w:eastAsia="Times New Roman" w:hAnsi="Bookman Old Style" w:cs="Times New Roman"/>
-          <w:kern w:val="0"/>
-          <w14:ligatures w14:val="none"/>
-        </w:rPr>
-        <w:br/>
-        <w:t>to give one tenth of all they earned</w:t>
-      </w:r>
-      <w:r>
-        <w:rPr>
-          <w:rFonts w:ascii="Bookman Old Style" w:eastAsia="Times New Roman" w:hAnsi="Bookman Old Style" w:cs="Times New Roman"/>
-          <w:kern w:val="0"/>
-          <w14:ligatures w14:val="none"/>
-        </w:rPr>
-        <w:br/>
-        <w:t>directly to the Levitical priesthood,</w:t>
-      </w:r>
-      <w:r>
-        <w:rPr>
-          <w:rFonts w:ascii="Bookman Old Style" w:eastAsia="Times New Roman" w:hAnsi="Bookman Old Style" w:cs="Times New Roman"/>
-          <w:kern w:val="0"/>
-          <w14:ligatures w14:val="none"/>
-        </w:rPr>
-        <w:br/>
-        <w:t>indirectly to God Most High.</w:t>
-      </w:r>
-    </w:p>
-    <w:p>
-      <w:pPr>
-        <w:rPr>
-          <w:rFonts w:ascii="Bookman Old Style" w:eastAsia="Times New Roman" w:hAnsi="Bookman Old Style" w:cs="Times New Roman"/>
-          <w:kern w:val="0"/>
-          <w14:ligatures w14:val="none"/>
-        </w:rPr>
-      </w:pPr>
-      <w:r>
-        <w:rPr>
-          <w:rFonts w:ascii="Bookman Old Style" w:eastAsia="Times New Roman" w:hAnsi="Bookman Old Style" w:cs="Times New Roman"/>
-          <w:kern w:val="0"/>
-          <w14:ligatures w14:val="none"/>
-        </w:rPr>
-        <w:t>Abram demonstrates the heart of the law</w:t>
-      </w:r>
-      <w:r>
-        <w:rPr>
-          <w:rFonts w:ascii="Bookman Old Style" w:eastAsia="Times New Roman" w:hAnsi="Bookman Old Style" w:cs="Times New Roman"/>
-          <w:kern w:val="0"/>
-          <w14:ligatures w14:val="none"/>
-        </w:rPr>
-        <w:br/>
-        <w:t>400 years before the letter of the law was written.</w:t>
-      </w:r>
-      <w:r>
-        <w:rPr>
-          <w:rFonts w:ascii="Bookman Old Style" w:eastAsia="Times New Roman" w:hAnsi="Bookman Old Style" w:cs="Times New Roman"/>
-          <w:kern w:val="0"/>
-          <w14:ligatures w14:val="none"/>
-        </w:rPr>
-        <w:br/>
         <w:t>He gave through genuine faith and gratitude,</w:t>
       </w:r>
       <w:r>
@@ -2060,26 +2231,24 @@
       <w:pPr>
         <w:rPr>
           <w:rFonts w:ascii="Bookman Old Style" w:eastAsia="Times New Roman" w:hAnsi="Bookman Old Style" w:cs="Times New Roman"/>
-          <w:i/>
-          <w:iCs/>
-          <w:kern w:val="0"/>
-          <w14:ligatures w14:val="none"/>
-        </w:rPr>
-      </w:pPr>
-      <w:r>
-        <w:rPr>
-          <w:rFonts w:ascii="Bookman Old Style" w:eastAsia="Times New Roman" w:hAnsi="Bookman Old Style" w:cs="Times New Roman"/>
-          <w:i/>
-          <w:iCs/>
-          <w:kern w:val="0"/>
-          <w14:ligatures w14:val="none"/>
-        </w:rPr>
-        <w:t>Read Hebrews 5:1–2</w:t>
-      </w:r>
-    </w:p>
-    <w:p>
-      <w:pPr>
-        <w:ind w:left="2160"/>
+          <w:color w:val="5B9BD5" w:themeColor="accent5"/>
+          <w:kern w:val="0"/>
+          <w:vertAlign w:val="superscript"/>
+          <w14:ligatures w14:val="none"/>
+        </w:rPr>
+      </w:pPr>
+      <w:r>
+        <w:rPr>
+          <w:rFonts w:ascii="Bookman Old Style" w:eastAsia="Times New Roman" w:hAnsi="Bookman Old Style" w:cs="Times New Roman"/>
+          <w:color w:val="5B9BD5" w:themeColor="accent5"/>
+          <w:kern w:val="0"/>
+          <w14:ligatures w14:val="none"/>
+        </w:rPr>
+        <w:t>For every high priest chosen from among men is appointed to act on behalf of men in relation to God, to offer gifts and sacrifices for sins. He can deal gently with the ignorant and wayward, since he himself is beset with weakness.</w:t>
+      </w:r>
+    </w:p>
+    <w:p>
+      <w:pPr>
         <w:rPr>
           <w:rFonts w:ascii="Bookman Old Style" w:eastAsia="Times New Roman" w:hAnsi="Bookman Old Style" w:cs="Times New Roman"/>
           <w:kern w:val="0"/>
@@ -2139,7 +2308,6 @@
     </w:p>
     <w:p>
       <w:pPr>
-        <w:ind w:left="2160"/>
         <w:rPr>
           <w:rFonts w:ascii="Bookman Old Style" w:eastAsia="Times New Roman" w:hAnsi="Bookman Old Style" w:cs="Times New Roman"/>
           <w:kern w:val="0"/>
@@ -2388,22 +2556,173 @@
       <w:pPr>
         <w:rPr>
           <w:rFonts w:ascii="Bookman Old Style" w:eastAsia="Times New Roman" w:hAnsi="Bookman Old Style" w:cs="Times New Roman"/>
-          <w:i/>
-          <w:iCs/>
-          <w:kern w:val="0"/>
-          <w14:ligatures w14:val="none"/>
-        </w:rPr>
-      </w:pPr>
-      <w:r>
-        <w:rPr>
-          <w:rFonts w:ascii="Bookman Old Style" w:eastAsia="Times New Roman" w:hAnsi="Bookman Old Style" w:cs="Times New Roman"/>
-          <w:i/>
-          <w:iCs/>
+          <w:color w:val="5B9BD5" w:themeColor="accent5"/>
+          <w:kern w:val="0"/>
+          <w14:ligatures w14:val="none"/>
+        </w:rPr>
+      </w:pPr>
+      <w:r>
+        <w:rPr>
+          <w:rFonts w:ascii="Bookman Old Style" w:eastAsia="Times New Roman" w:hAnsi="Bookman Old Style" w:cs="Times New Roman"/>
+          <w:color w:val="5B9BD5" w:themeColor="accent5"/>
+          <w:kern w:val="0"/>
+          <w14:ligatures w14:val="none"/>
+        </w:rPr>
+        <w:t xml:space="preserve">Because of this he is obligated to offer sacrifice for his own sins just as he does for those of the people. And no one takes this honor for himself, but only when called by God, just as Aaron was. </w:t>
+      </w:r>
+    </w:p>
+    <w:p>
+      <w:pPr>
+        <w:rPr>
+          <w:rFonts w:ascii="Bookman Old Style" w:eastAsia="Times New Roman" w:hAnsi="Bookman Old Style" w:cs="Times New Roman"/>
+          <w:color w:val="5B9BD5" w:themeColor="accent5"/>
+          <w:kern w:val="0"/>
+          <w14:ligatures w14:val="none"/>
+        </w:rPr>
+      </w:pPr>
+      <w:r>
+        <w:rPr>
+          <w:rFonts w:ascii="Bookman Old Style" w:eastAsia="Times New Roman" w:hAnsi="Bookman Old Style" w:cs="Times New Roman"/>
+          <w:color w:val="5B9BD5" w:themeColor="accent5"/>
+          <w:kern w:val="0"/>
+          <w14:ligatures w14:val="none"/>
+        </w:rPr>
+        <w:t xml:space="preserve">So </w:t>
+      </w:r>
+      <w:proofErr w:type="gramStart"/>
+      <w:r>
+        <w:rPr>
+          <w:rFonts w:ascii="Bookman Old Style" w:eastAsia="Times New Roman" w:hAnsi="Bookman Old Style" w:cs="Times New Roman"/>
+          <w:color w:val="5B9BD5" w:themeColor="accent5"/>
+          <w:kern w:val="0"/>
+          <w14:ligatures w14:val="none"/>
+        </w:rPr>
+        <w:t>also</w:t>
+      </w:r>
+      <w:proofErr w:type="gramEnd"/>
+      <w:r>
+        <w:rPr>
+          <w:rFonts w:ascii="Bookman Old Style" w:eastAsia="Times New Roman" w:hAnsi="Bookman Old Style" w:cs="Times New Roman"/>
+          <w:color w:val="5B9BD5" w:themeColor="accent5"/>
+          <w:kern w:val="0"/>
+          <w14:ligatures w14:val="none"/>
+        </w:rPr>
+        <w:t xml:space="preserve"> Christ did not exalt himself to be made a high priest, but was appointed by him who said to him, </w:t>
+      </w:r>
+    </w:p>
+    <w:p>
+      <w:pPr>
+        <w:rPr>
+          <w:rFonts w:ascii="Bookman Old Style" w:eastAsia="Times New Roman" w:hAnsi="Bookman Old Style" w:cs="Times New Roman"/>
+          <w:color w:val="5B9BD5" w:themeColor="accent5"/>
+          <w:kern w:val="0"/>
+          <w14:ligatures w14:val="none"/>
+        </w:rPr>
+      </w:pPr>
+      <w:r>
+        <w:rPr>
+          <w:rFonts w:ascii="Bookman Old Style" w:eastAsia="Times New Roman" w:hAnsi="Bookman Old Style" w:cs="Times New Roman"/>
+          <w:color w:val="5B9BD5" w:themeColor="accent5"/>
+          <w:kern w:val="0"/>
+          <w14:ligatures w14:val="none"/>
+        </w:rPr>
+        <w:t>“You are my Son,</w:t>
+      </w:r>
+      <w:r>
+        <w:rPr>
+          <w:rFonts w:ascii="Bookman Old Style" w:eastAsia="Times New Roman" w:hAnsi="Bookman Old Style" w:cs="Times New Roman"/>
+          <w:color w:val="5B9BD5" w:themeColor="accent5"/>
+          <w:kern w:val="0"/>
+          <w14:ligatures w14:val="none"/>
+        </w:rPr>
+        <w:br/>
+        <w:t xml:space="preserve">          </w:t>
+      </w:r>
+      <w:r>
+        <w:rPr>
+          <w:rFonts w:ascii="Bookman Old Style" w:eastAsia="Times New Roman" w:hAnsi="Bookman Old Style" w:cs="Times New Roman"/>
+          <w:color w:val="5B9BD5" w:themeColor="accent5"/>
+          <w:kern w:val="0"/>
+          <w14:ligatures w14:val="none"/>
+        </w:rPr>
+        <w:t>today I have begotten you”;</w:t>
+      </w:r>
+    </w:p>
+    <w:p>
+      <w:pPr>
+        <w:rPr>
+          <w:rFonts w:ascii="Bookman Old Style" w:eastAsia="Times New Roman" w:hAnsi="Bookman Old Style" w:cs="Times New Roman"/>
+          <w:color w:val="5B9BD5" w:themeColor="accent5"/>
+          <w:kern w:val="0"/>
+          <w14:ligatures w14:val="none"/>
+        </w:rPr>
+      </w:pPr>
+      <w:r>
+        <w:rPr>
+          <w:rFonts w:ascii="Bookman Old Style" w:eastAsia="Times New Roman" w:hAnsi="Bookman Old Style" w:cs="Times New Roman"/>
+          <w:color w:val="5B9BD5" w:themeColor="accent5"/>
           <w:kern w:val="0"/>
           <w14:ligatures w14:val="none"/>
         </w:rPr>
         <w:lastRenderedPageBreak/>
-        <w:t>Read Hebrews 5:3–7</w:t>
+        <w:t>as he says also in another place,</w:t>
+      </w:r>
+    </w:p>
+    <w:p>
+      <w:pPr>
+        <w:rPr>
+          <w:rFonts w:ascii="Bookman Old Style" w:eastAsia="Times New Roman" w:hAnsi="Bookman Old Style" w:cs="Times New Roman"/>
+          <w:color w:val="5B9BD5" w:themeColor="accent5"/>
+          <w:kern w:val="0"/>
+          <w14:ligatures w14:val="none"/>
+        </w:rPr>
+      </w:pPr>
+      <w:r>
+        <w:rPr>
+          <w:rFonts w:ascii="Bookman Old Style" w:eastAsia="Times New Roman" w:hAnsi="Bookman Old Style" w:cs="Times New Roman"/>
+          <w:color w:val="5B9BD5" w:themeColor="accent5"/>
+          <w:kern w:val="0"/>
+          <w14:ligatures w14:val="none"/>
+        </w:rPr>
+        <w:t>“You are a priest forever,</w:t>
+      </w:r>
+      <w:r>
+        <w:rPr>
+          <w:rFonts w:ascii="Bookman Old Style" w:eastAsia="Times New Roman" w:hAnsi="Bookman Old Style" w:cs="Times New Roman"/>
+          <w:color w:val="5B9BD5" w:themeColor="accent5"/>
+          <w:kern w:val="0"/>
+          <w14:ligatures w14:val="none"/>
+        </w:rPr>
+        <w:br/>
+        <w:t xml:space="preserve">          </w:t>
+      </w:r>
+      <w:r>
+        <w:rPr>
+          <w:rFonts w:ascii="Bookman Old Style" w:eastAsia="Times New Roman" w:hAnsi="Bookman Old Style" w:cs="Times New Roman"/>
+          <w:color w:val="5B9BD5" w:themeColor="accent5"/>
+          <w:kern w:val="0"/>
+          <w14:ligatures w14:val="none"/>
+        </w:rPr>
+        <w:t>after the order of Melchizedek.”</w:t>
+      </w:r>
+    </w:p>
+    <w:p>
+      <w:pPr>
+        <w:rPr>
+          <w:rFonts w:ascii="Bookman Old Style" w:eastAsia="Times New Roman" w:hAnsi="Bookman Old Style" w:cs="Times New Roman"/>
+          <w:color w:val="5B9BD5" w:themeColor="accent5"/>
+          <w:kern w:val="0"/>
+          <w14:ligatures w14:val="none"/>
+        </w:rPr>
+      </w:pPr>
+      <w:r>
+        <w:rPr>
+          <w:rFonts w:ascii="Bookman Old Style" w:eastAsia="Times New Roman" w:hAnsi="Bookman Old Style" w:cs="Times New Roman"/>
+          <w:color w:val="5B9BD5" w:themeColor="accent5"/>
+          <w:kern w:val="0"/>
+          <w14:ligatures w14:val="none"/>
+        </w:rPr>
+        <w:t>In the days of his flesh, Jesus offered up prayers and supplications, with loud cries and tears, to him who was able to save him from death, and he was heard because of his reverence.</w:t>
       </w:r>
     </w:p>
     <w:p>
@@ -2627,7 +2946,6 @@
     </w:p>
     <w:p>
       <w:pPr>
-        <w:ind w:left="2160"/>
         <w:rPr>
           <w:rFonts w:ascii="Bookman Old Style" w:eastAsia="Times New Roman" w:hAnsi="Bookman Old Style" w:cs="Times New Roman"/>
           <w:kern w:val="0"/>
@@ -2662,7 +2980,6 @@
     </w:p>
     <w:p>
       <w:pPr>
-        <w:ind w:left="2160"/>
         <w:rPr>
           <w:rFonts w:ascii="Bookman Old Style" w:eastAsia="Times New Roman" w:hAnsi="Bookman Old Style" w:cs="Times New Roman"/>
           <w:kern w:val="0"/>
@@ -2707,7 +3024,6 @@
     </w:p>
     <w:p>
       <w:pPr>
-        <w:ind w:left="2160"/>
         <w:rPr>
           <w:rFonts w:ascii="Bookman Old Style" w:eastAsia="Times New Roman" w:hAnsi="Bookman Old Style" w:cs="Times New Roman"/>
           <w:kern w:val="0"/>
@@ -2854,6 +3170,7 @@
           <w:kern w:val="0"/>
           <w14:ligatures w14:val="none"/>
         </w:rPr>
+        <w:lastRenderedPageBreak/>
         <w:t>The blood in Mosaic sacrifices points to</w:t>
       </w:r>
       <w:r>
@@ -2889,7 +3206,6 @@
           <w:kern w:val="0"/>
           <w14:ligatures w14:val="none"/>
         </w:rPr>
-        <w:lastRenderedPageBreak/>
         <w:t>Praise the LORD!</w:t>
       </w:r>
     </w:p>
@@ -3268,7 +3584,6 @@
     </w:p>
     <w:p>
       <w:pPr>
-        <w:ind w:left="2160"/>
         <w:rPr>
           <w:rFonts w:ascii="Bookman Old Style" w:eastAsia="Times New Roman" w:hAnsi="Bookman Old Style" w:cs="Times New Roman"/>
           <w:kern w:val="0"/>
@@ -3349,6 +3664,7 @@
           <w:kern w:val="0"/>
           <w14:ligatures w14:val="none"/>
         </w:rPr>
+        <w:lastRenderedPageBreak/>
         <w:t xml:space="preserve">Let’s talk about Hebrews </w:t>
       </w:r>
       <w:r>
@@ -3425,605 +3741,622 @@
           <w:kern w:val="0"/>
           <w14:ligatures w14:val="none"/>
         </w:rPr>
+        <w:t>Listen to verses 1-3.</w:t>
+      </w:r>
+    </w:p>
+    <w:p>
+      <w:pPr>
+        <w:rPr>
+          <w:rFonts w:ascii="Bookman Old Style" w:eastAsia="Times New Roman" w:hAnsi="Bookman Old Style" w:cs="Times New Roman"/>
+          <w:color w:val="5B9BD5" w:themeColor="accent5"/>
+          <w:kern w:val="0"/>
+          <w14:ligatures w14:val="none"/>
+        </w:rPr>
+      </w:pPr>
+      <w:r>
+        <w:rPr>
+          <w:rFonts w:ascii="Bookman Old Style" w:eastAsia="Times New Roman" w:hAnsi="Bookman Old Style" w:cs="Times New Roman"/>
+          <w:color w:val="5B9BD5" w:themeColor="accent5"/>
+          <w:kern w:val="0"/>
+          <w14:ligatures w14:val="none"/>
+        </w:rPr>
+        <w:t xml:space="preserve">For this Melchizedek, king of Salem, priest of the </w:t>
+      </w:r>
+      <w:proofErr w:type="gramStart"/>
+      <w:r>
+        <w:rPr>
+          <w:rFonts w:ascii="Bookman Old Style" w:eastAsia="Times New Roman" w:hAnsi="Bookman Old Style" w:cs="Times New Roman"/>
+          <w:color w:val="5B9BD5" w:themeColor="accent5"/>
+          <w:kern w:val="0"/>
+          <w14:ligatures w14:val="none"/>
+        </w:rPr>
+        <w:t>Most High</w:t>
+      </w:r>
+      <w:proofErr w:type="gramEnd"/>
+      <w:r>
+        <w:rPr>
+          <w:rFonts w:ascii="Bookman Old Style" w:eastAsia="Times New Roman" w:hAnsi="Bookman Old Style" w:cs="Times New Roman"/>
+          <w:color w:val="5B9BD5" w:themeColor="accent5"/>
+          <w:kern w:val="0"/>
+          <w14:ligatures w14:val="none"/>
+        </w:rPr>
+        <w:t xml:space="preserve"> God, met Abraham returning from the slaughter of the kings and blessed him, and to him Abraham apportioned a tenth part of everything. He is first, by translation of his name, king of righteousness, and then he is also king of Salem, that is, king of peace. He is without father or mother or genealogy, having neither beginning of days nor end of life, but resembling the Son of God he continues a priest forever.</w:t>
+      </w:r>
+    </w:p>
+    <w:p>
+      <w:pPr>
+        <w:rPr>
+          <w:rFonts w:ascii="Bookman Old Style" w:eastAsia="Times New Roman" w:hAnsi="Bookman Old Style" w:cs="Times New Roman"/>
+          <w:kern w:val="0"/>
+          <w14:ligatures w14:val="none"/>
+        </w:rPr>
+      </w:pPr>
+      <w:r>
+        <w:rPr>
+          <w:rFonts w:ascii="Bookman Old Style" w:eastAsia="Times New Roman" w:hAnsi="Bookman Old Style" w:cs="Times New Roman"/>
+          <w:kern w:val="0"/>
+          <w14:ligatures w14:val="none"/>
+        </w:rPr>
+        <w:t>Melchizedek = king of righteousness → Jesus</w:t>
+      </w:r>
+      <w:r>
+        <w:rPr>
+          <w:rFonts w:ascii="Bookman Old Style" w:eastAsia="Times New Roman" w:hAnsi="Bookman Old Style" w:cs="Times New Roman"/>
+          <w:kern w:val="0"/>
+          <w14:ligatures w14:val="none"/>
+        </w:rPr>
+        <w:br/>
+        <w:t>King of Salem = king of peace → Jesus</w:t>
+      </w:r>
+    </w:p>
+    <w:p>
+      <w:pPr>
+        <w:rPr>
+          <w:rFonts w:ascii="Bookman Old Style" w:eastAsia="Times New Roman" w:hAnsi="Bookman Old Style" w:cs="Times New Roman"/>
+          <w:kern w:val="0"/>
+          <w14:ligatures w14:val="none"/>
+        </w:rPr>
+      </w:pPr>
+      <w:r>
+        <w:rPr>
+          <w:rFonts w:ascii="Bookman Old Style" w:eastAsia="Times New Roman" w:hAnsi="Bookman Old Style" w:cs="Times New Roman"/>
+          <w:kern w:val="0"/>
+          <w14:ligatures w14:val="none"/>
+        </w:rPr>
+        <w:t xml:space="preserve">Personally, I prefer </w:t>
+      </w:r>
+      <w:r>
+        <w:rPr>
+          <w:rFonts w:ascii="Bookman Old Style" w:eastAsia="Times New Roman" w:hAnsi="Bookman Old Style" w:cs="Times New Roman"/>
+          <w:kern w:val="0"/>
+          <w14:ligatures w14:val="none"/>
+        </w:rPr>
+        <w:t xml:space="preserve">the sound </w:t>
+      </w:r>
+      <w:r>
+        <w:rPr>
+          <w:rFonts w:ascii="Bookman Old Style" w:eastAsia="Times New Roman" w:hAnsi="Bookman Old Style" w:cs="Times New Roman"/>
+          <w:kern w:val="0"/>
+          <w14:ligatures w14:val="none"/>
+        </w:rPr>
+        <w:t xml:space="preserve">of the </w:t>
+      </w:r>
+      <w:r>
+        <w:rPr>
+          <w:rFonts w:ascii="Bookman Old Style" w:eastAsia="Times New Roman" w:hAnsi="Bookman Old Style" w:cs="Times New Roman"/>
+          <w:kern w:val="0"/>
+          <w14:ligatures w14:val="none"/>
+        </w:rPr>
+        <w:t xml:space="preserve">Hebrew </w:t>
+      </w:r>
+      <w:r>
+        <w:rPr>
+          <w:rFonts w:ascii="Bookman Old Style" w:eastAsia="Times New Roman" w:hAnsi="Bookman Old Style" w:cs="Times New Roman"/>
+          <w:kern w:val="0"/>
+          <w14:ligatures w14:val="none"/>
+        </w:rPr>
+        <w:t>pronunciation</w:t>
+      </w:r>
+      <w:r>
+        <w:rPr>
+          <w:rFonts w:ascii="Bookman Old Style" w:eastAsia="Times New Roman" w:hAnsi="Bookman Old Style" w:cs="Times New Roman"/>
+          <w:kern w:val="0"/>
+          <w14:ligatures w14:val="none"/>
+        </w:rPr>
+        <w:br/>
+      </w:r>
+      <w:r>
+        <w:rPr>
+          <w:rFonts w:ascii="Bookman Old Style" w:eastAsia="Times New Roman" w:hAnsi="Bookman Old Style" w:cs="Times New Roman"/>
+          <w:kern w:val="0"/>
+          <w14:ligatures w14:val="none"/>
+        </w:rPr>
+        <w:t xml:space="preserve">for </w:t>
+      </w:r>
+      <w:r>
+        <w:rPr>
+          <w:rFonts w:ascii="Bookman Old Style" w:eastAsia="Times New Roman" w:hAnsi="Bookman Old Style" w:cs="Times New Roman"/>
+          <w:kern w:val="0"/>
+          <w14:ligatures w14:val="none"/>
+        </w:rPr>
+        <w:t>SAY-lum</w:t>
+      </w:r>
+      <w:r>
+        <w:rPr>
+          <w:rFonts w:ascii="Bookman Old Style" w:eastAsia="Times New Roman" w:hAnsi="Bookman Old Style" w:cs="Times New Roman"/>
+          <w:kern w:val="0"/>
+          <w14:ligatures w14:val="none"/>
+        </w:rPr>
+        <w:t>,</w:t>
+      </w:r>
+      <w:r>
+        <w:rPr>
+          <w:rFonts w:ascii="Bookman Old Style" w:eastAsia="Times New Roman" w:hAnsi="Bookman Old Style" w:cs="Times New Roman"/>
+          <w:kern w:val="0"/>
+          <w14:ligatures w14:val="none"/>
+        </w:rPr>
+        <w:br/>
+      </w:r>
+      <w:r>
+        <w:rPr>
+          <w:rFonts w:ascii="Bookman Old Style" w:eastAsia="Times New Roman" w:hAnsi="Bookman Old Style" w:cs="Times New Roman"/>
+          <w:kern w:val="0"/>
+          <w14:ligatures w14:val="none"/>
+        </w:rPr>
+        <w:t xml:space="preserve">which would sound more like </w:t>
+      </w:r>
+      <w:r>
+        <w:rPr>
+          <w:rFonts w:ascii="Bookman Old Style" w:eastAsia="Times New Roman" w:hAnsi="Bookman Old Style" w:cs="Times New Roman"/>
+          <w:kern w:val="0"/>
+          <w14:ligatures w14:val="none"/>
+        </w:rPr>
+        <w:t>shah-LAYM</w:t>
+      </w:r>
+      <w:r>
+        <w:rPr>
+          <w:rFonts w:ascii="Bookman Old Style" w:eastAsia="Times New Roman" w:hAnsi="Bookman Old Style" w:cs="Times New Roman"/>
+          <w:kern w:val="0"/>
+          <w14:ligatures w14:val="none"/>
+        </w:rPr>
+        <w:t>,</w:t>
+      </w:r>
+      <w:r>
+        <w:rPr>
+          <w:rFonts w:ascii="Bookman Old Style" w:eastAsia="Times New Roman" w:hAnsi="Bookman Old Style" w:cs="Times New Roman"/>
+          <w:kern w:val="0"/>
+          <w14:ligatures w14:val="none"/>
+        </w:rPr>
+        <w:br/>
+        <w:t>because it sounds more like the root word,</w:t>
+      </w:r>
+      <w:r>
+        <w:rPr>
+          <w:rFonts w:ascii="Bookman Old Style" w:eastAsia="Times New Roman" w:hAnsi="Bookman Old Style" w:cs="Times New Roman"/>
+          <w:kern w:val="0"/>
+          <w14:ligatures w14:val="none"/>
+        </w:rPr>
+        <w:br/>
+      </w:r>
+      <w:r>
+        <w:rPr>
+          <w:rFonts w:ascii="Bookman Old Style" w:eastAsia="Times New Roman" w:hAnsi="Bookman Old Style" w:cs="Times New Roman"/>
+          <w:kern w:val="0"/>
+          <w14:ligatures w14:val="none"/>
+        </w:rPr>
+        <w:t>shah-LOHM</w:t>
+      </w:r>
+      <w:r>
+        <w:rPr>
+          <w:rFonts w:ascii="Bookman Old Style" w:eastAsia="Times New Roman" w:hAnsi="Bookman Old Style" w:cs="Times New Roman"/>
+          <w:kern w:val="0"/>
+          <w14:ligatures w14:val="none"/>
+        </w:rPr>
+        <w:t>, for peace.</w:t>
+      </w:r>
+    </w:p>
+    <w:p>
+      <w:pPr>
+        <w:rPr>
+          <w:rFonts w:ascii="Bookman Old Style" w:eastAsia="Times New Roman" w:hAnsi="Bookman Old Style" w:cs="Times New Roman"/>
+          <w:kern w:val="0"/>
+          <w14:ligatures w14:val="none"/>
+        </w:rPr>
+      </w:pPr>
+      <w:r>
+        <w:rPr>
+          <w:rFonts w:ascii="Bookman Old Style" w:eastAsia="Times New Roman" w:hAnsi="Bookman Old Style" w:cs="Times New Roman"/>
+          <w:kern w:val="0"/>
+          <w14:ligatures w14:val="none"/>
+        </w:rPr>
+        <w:t>It has a more gentle and peaceful resonance to it.</w:t>
+      </w:r>
+    </w:p>
+    <w:p>
+      <w:pPr>
+        <w:rPr>
+          <w:rFonts w:ascii="Bookman Old Style" w:eastAsia="Times New Roman" w:hAnsi="Bookman Old Style" w:cs="Times New Roman"/>
+          <w:kern w:val="0"/>
+          <w14:ligatures w14:val="none"/>
+        </w:rPr>
+      </w:pPr>
+      <w:r>
+        <w:rPr>
+          <w:rFonts w:ascii="Bookman Old Style" w:eastAsia="Times New Roman" w:hAnsi="Bookman Old Style" w:cs="Times New Roman"/>
+          <w:kern w:val="0"/>
+          <w14:ligatures w14:val="none"/>
+        </w:rPr>
+        <w:t>Anyway, moving on…</w:t>
+      </w:r>
+    </w:p>
+    <w:p>
+      <w:pPr>
+        <w:rPr>
+          <w:rFonts w:ascii="Bookman Old Style" w:eastAsia="Times New Roman" w:hAnsi="Bookman Old Style" w:cs="Times New Roman"/>
+          <w:kern w:val="0"/>
+          <w14:ligatures w14:val="none"/>
+        </w:rPr>
+      </w:pPr>
+      <w:r>
+        <w:rPr>
+          <w:rFonts w:ascii="Bookman Old Style" w:eastAsia="Times New Roman" w:hAnsi="Bookman Old Style" w:cs="Times New Roman"/>
+          <w:kern w:val="0"/>
+          <w14:ligatures w14:val="none"/>
+        </w:rPr>
+        <w:t>Melchizedek</w:t>
+      </w:r>
+      <w:r>
+        <w:rPr>
+          <w:rFonts w:ascii="Bookman Old Style" w:eastAsia="Times New Roman" w:hAnsi="Bookman Old Style" w:cs="Times New Roman"/>
+          <w:kern w:val="0"/>
+          <w14:ligatures w14:val="none"/>
+        </w:rPr>
+        <w:t xml:space="preserve"> has n</w:t>
+      </w:r>
+      <w:r>
+        <w:rPr>
+          <w:rFonts w:ascii="Bookman Old Style" w:eastAsia="Times New Roman" w:hAnsi="Bookman Old Style" w:cs="Times New Roman"/>
+          <w:kern w:val="0"/>
+          <w14:ligatures w14:val="none"/>
+        </w:rPr>
+        <w:t>o genealogy, beginning, or end:</w:t>
+      </w:r>
+      <w:r>
+        <w:rPr>
+          <w:rFonts w:ascii="Bookman Old Style" w:eastAsia="Times New Roman" w:hAnsi="Bookman Old Style" w:cs="Times New Roman"/>
+          <w:kern w:val="0"/>
+          <w14:ligatures w14:val="none"/>
+        </w:rPr>
+        <w:br/>
+      </w:r>
+      <w:r>
+        <w:rPr>
+          <w:rFonts w:ascii="Bookman Old Style" w:eastAsia="Times New Roman" w:hAnsi="Bookman Old Style" w:cs="Times New Roman"/>
+          <w:kern w:val="0"/>
+          <w14:ligatures w14:val="none"/>
+        </w:rPr>
+        <w:t>This r</w:t>
+      </w:r>
+      <w:r>
+        <w:rPr>
+          <w:rFonts w:ascii="Bookman Old Style" w:eastAsia="Times New Roman" w:hAnsi="Bookman Old Style" w:cs="Times New Roman"/>
+          <w:kern w:val="0"/>
+          <w14:ligatures w14:val="none"/>
+        </w:rPr>
+        <w:t xml:space="preserve">eminds me of </w:t>
+      </w:r>
+      <w:r>
+        <w:rPr>
+          <w:rFonts w:ascii="Bookman Old Style" w:eastAsia="Times New Roman" w:hAnsi="Bookman Old Style" w:cs="Times New Roman"/>
+          <w:kern w:val="0"/>
+          <w14:ligatures w14:val="none"/>
+        </w:rPr>
+        <w:t>a certain title for God the Father</w:t>
+      </w:r>
+      <w:r>
+        <w:rPr>
+          <w:rFonts w:ascii="Bookman Old Style" w:eastAsia="Times New Roman" w:hAnsi="Bookman Old Style" w:cs="Times New Roman"/>
+          <w:kern w:val="0"/>
+          <w14:ligatures w14:val="none"/>
+        </w:rPr>
+        <w:t xml:space="preserve"> —</w:t>
+      </w:r>
+      <w:r>
+        <w:rPr>
+          <w:rFonts w:ascii="Bookman Old Style" w:eastAsia="Times New Roman" w:hAnsi="Bookman Old Style" w:cs="Times New Roman"/>
+          <w:kern w:val="0"/>
+          <w14:ligatures w14:val="none"/>
+        </w:rPr>
+        <w:t xml:space="preserve"> Alpha &amp; Omega</w:t>
+      </w:r>
+      <w:r>
+        <w:rPr>
+          <w:rFonts w:ascii="Bookman Old Style" w:eastAsia="Times New Roman" w:hAnsi="Bookman Old Style" w:cs="Times New Roman"/>
+          <w:kern w:val="0"/>
+          <w14:ligatures w14:val="none"/>
+        </w:rPr>
+        <w:t>.</w:t>
+      </w:r>
+      <w:r>
+        <w:rPr>
+          <w:rFonts w:ascii="Bookman Old Style" w:eastAsia="Times New Roman" w:hAnsi="Bookman Old Style" w:cs="Times New Roman"/>
+          <w:kern w:val="0"/>
+          <w14:ligatures w14:val="none"/>
+        </w:rPr>
+        <w:br/>
+        <w:t xml:space="preserve">Similarly, yet still intentionally submissive to </w:t>
+      </w:r>
+      <w:r>
+        <w:rPr>
+          <w:rFonts w:ascii="Bookman Old Style" w:eastAsia="Times New Roman" w:hAnsi="Bookman Old Style" w:cs="Times New Roman"/>
+          <w:kern w:val="0"/>
+          <w14:ligatures w14:val="none"/>
+        </w:rPr>
+        <w:t>t</w:t>
+      </w:r>
+      <w:r>
+        <w:rPr>
+          <w:rFonts w:ascii="Bookman Old Style" w:eastAsia="Times New Roman" w:hAnsi="Bookman Old Style" w:cs="Times New Roman"/>
+          <w:kern w:val="0"/>
+          <w14:ligatures w14:val="none"/>
+        </w:rPr>
+        <w:t>he Father —</w:t>
+      </w:r>
+      <w:r>
+        <w:rPr>
+          <w:rFonts w:ascii="Bookman Old Style" w:eastAsia="Times New Roman" w:hAnsi="Bookman Old Style" w:cs="Times New Roman"/>
+          <w:kern w:val="0"/>
+          <w14:ligatures w14:val="none"/>
+        </w:rPr>
+        <w:br/>
+      </w:r>
+      <w:r>
+        <w:rPr>
+          <w:rFonts w:ascii="Bookman Old Style" w:eastAsia="Times New Roman" w:hAnsi="Bookman Old Style" w:cs="Times New Roman"/>
+          <w:kern w:val="0"/>
+          <w14:ligatures w14:val="none"/>
+        </w:rPr>
+        <w:t xml:space="preserve">Revelation 1:17 says that Jesus is </w:t>
+      </w:r>
+      <w:r>
+        <w:rPr>
+          <w:rFonts w:ascii="Bookman Old Style" w:eastAsia="Times New Roman" w:hAnsi="Bookman Old Style" w:cs="Times New Roman"/>
+          <w:kern w:val="0"/>
+          <w14:ligatures w14:val="none"/>
+        </w:rPr>
+        <w:t>“the first and the last”</w:t>
+      </w:r>
+      <w:r>
+        <w:rPr>
+          <w:rFonts w:ascii="Bookman Old Style" w:eastAsia="Times New Roman" w:hAnsi="Bookman Old Style" w:cs="Times New Roman"/>
+          <w:kern w:val="0"/>
+          <w14:ligatures w14:val="none"/>
+        </w:rPr>
+        <w:t>.</w:t>
+      </w:r>
+    </w:p>
+    <w:p>
+      <w:pPr>
+        <w:rPr>
+          <w:rFonts w:ascii="Bookman Old Style" w:eastAsia="Times New Roman" w:hAnsi="Bookman Old Style" w:cs="Times New Roman"/>
+          <w:kern w:val="0"/>
+          <w14:ligatures w14:val="none"/>
+        </w:rPr>
+      </w:pPr>
+      <w:r>
+        <w:rPr>
+          <w:rFonts w:ascii="Bookman Old Style" w:eastAsia="Times New Roman" w:hAnsi="Bookman Old Style" w:cs="Times New Roman"/>
+          <w:kern w:val="0"/>
+          <w14:ligatures w14:val="none"/>
+        </w:rPr>
+        <w:t xml:space="preserve">Verse 3 </w:t>
+      </w:r>
+      <w:r>
+        <w:rPr>
+          <w:rFonts w:ascii="Bookman Old Style" w:eastAsia="Times New Roman" w:hAnsi="Bookman Old Style" w:cs="Times New Roman"/>
+          <w:kern w:val="0"/>
+          <w14:ligatures w14:val="none"/>
+        </w:rPr>
+        <w:t>says that</w:t>
+      </w:r>
+      <w:r>
+        <w:rPr>
+          <w:rFonts w:ascii="Bookman Old Style" w:eastAsia="Times New Roman" w:hAnsi="Bookman Old Style" w:cs="Times New Roman"/>
+          <w:kern w:val="0"/>
+          <w14:ligatures w14:val="none"/>
+        </w:rPr>
+        <w:t xml:space="preserve"> Melchizedek “resembles the Son of God”</w:t>
+      </w:r>
+      <w:r>
+        <w:rPr>
+          <w:rFonts w:ascii="Bookman Old Style" w:eastAsia="Times New Roman" w:hAnsi="Bookman Old Style" w:cs="Times New Roman"/>
+          <w:kern w:val="0"/>
+          <w14:ligatures w14:val="none"/>
+        </w:rPr>
+        <w:t>.</w:t>
+      </w:r>
+      <w:r>
+        <w:rPr>
+          <w:rFonts w:ascii="Bookman Old Style" w:eastAsia="Times New Roman" w:hAnsi="Bookman Old Style" w:cs="Times New Roman"/>
+          <w:kern w:val="0"/>
+          <w14:ligatures w14:val="none"/>
+        </w:rPr>
+        <w:br/>
+      </w:r>
+      <w:r>
+        <w:rPr>
+          <w:rFonts w:ascii="Bookman Old Style" w:eastAsia="Times New Roman" w:hAnsi="Bookman Old Style" w:cs="Times New Roman"/>
+          <w:kern w:val="0"/>
+          <w14:ligatures w14:val="none"/>
+        </w:rPr>
+        <w:t>I want to clarify that t</w:t>
+      </w:r>
+      <w:r>
+        <w:rPr>
+          <w:rFonts w:ascii="Bookman Old Style" w:eastAsia="Times New Roman" w:hAnsi="Bookman Old Style" w:cs="Times New Roman"/>
+          <w:kern w:val="0"/>
+          <w14:ligatures w14:val="none"/>
+        </w:rPr>
+        <w:t>his is not a theophany</w:t>
+      </w:r>
+      <w:r>
+        <w:rPr>
+          <w:rFonts w:ascii="Bookman Old Style" w:eastAsia="Times New Roman" w:hAnsi="Bookman Old Style" w:cs="Times New Roman"/>
+          <w:kern w:val="0"/>
+          <w14:ligatures w14:val="none"/>
+        </w:rPr>
+        <w:t xml:space="preserve"> —</w:t>
+      </w:r>
+      <w:r>
+        <w:rPr>
+          <w:rFonts w:ascii="Bookman Old Style" w:eastAsia="Times New Roman" w:hAnsi="Bookman Old Style" w:cs="Times New Roman"/>
+          <w:kern w:val="0"/>
+          <w14:ligatures w14:val="none"/>
+        </w:rPr>
+        <w:br/>
+        <w:t>a literal appearance of God</w:t>
+      </w:r>
+      <w:r>
+        <w:rPr>
+          <w:rFonts w:ascii="Bookman Old Style" w:eastAsia="Times New Roman" w:hAnsi="Bookman Old Style" w:cs="Times New Roman"/>
+          <w:kern w:val="0"/>
+          <w14:ligatures w14:val="none"/>
+        </w:rPr>
+        <w:t xml:space="preserve"> in some form</w:t>
+      </w:r>
+      <w:r>
+        <w:rPr>
+          <w:rFonts w:ascii="Bookman Old Style" w:eastAsia="Times New Roman" w:hAnsi="Bookman Old Style" w:cs="Times New Roman"/>
+          <w:kern w:val="0"/>
+          <w14:ligatures w14:val="none"/>
+        </w:rPr>
+        <w:t xml:space="preserve"> —</w:t>
+      </w:r>
+      <w:r>
+        <w:rPr>
+          <w:rFonts w:ascii="Bookman Old Style" w:eastAsia="Times New Roman" w:hAnsi="Bookman Old Style" w:cs="Times New Roman"/>
+          <w:kern w:val="0"/>
+          <w14:ligatures w14:val="none"/>
+        </w:rPr>
+        <w:br/>
+        <w:t>or a Christophany</w:t>
+      </w:r>
+      <w:r>
+        <w:rPr>
+          <w:rFonts w:ascii="Bookman Old Style" w:eastAsia="Times New Roman" w:hAnsi="Bookman Old Style" w:cs="Times New Roman"/>
+          <w:kern w:val="0"/>
+          <w14:ligatures w14:val="none"/>
+        </w:rPr>
+        <w:t xml:space="preserve"> —</w:t>
+      </w:r>
+      <w:r>
+        <w:rPr>
+          <w:rFonts w:ascii="Bookman Old Style" w:eastAsia="Times New Roman" w:hAnsi="Bookman Old Style" w:cs="Times New Roman"/>
+          <w:kern w:val="0"/>
+          <w14:ligatures w14:val="none"/>
+        </w:rPr>
+        <w:br/>
+      </w:r>
+      <w:r>
+        <w:rPr>
+          <w:rFonts w:ascii="Bookman Old Style" w:eastAsia="Times New Roman" w:hAnsi="Bookman Old Style" w:cs="Times New Roman"/>
+          <w:kern w:val="0"/>
+          <w14:ligatures w14:val="none"/>
+        </w:rPr>
+        <w:t xml:space="preserve">a literal appearance of </w:t>
+      </w:r>
+      <w:r>
+        <w:rPr>
+          <w:rFonts w:ascii="Bookman Old Style" w:eastAsia="Times New Roman" w:hAnsi="Bookman Old Style" w:cs="Times New Roman"/>
+          <w:kern w:val="0"/>
+          <w14:ligatures w14:val="none"/>
+        </w:rPr>
+        <w:t xml:space="preserve">God through </w:t>
+      </w:r>
+      <w:r>
+        <w:rPr>
+          <w:rFonts w:ascii="Bookman Old Style" w:eastAsia="Times New Roman" w:hAnsi="Bookman Old Style" w:cs="Times New Roman"/>
+          <w:kern w:val="0"/>
+          <w14:ligatures w14:val="none"/>
+        </w:rPr>
+        <w:t>Christ.</w:t>
+      </w:r>
+    </w:p>
+    <w:p>
+      <w:pPr>
+        <w:rPr>
+          <w:rFonts w:ascii="Bookman Old Style" w:eastAsia="Times New Roman" w:hAnsi="Bookman Old Style" w:cs="Times New Roman"/>
+          <w:kern w:val="0"/>
+          <w14:ligatures w14:val="none"/>
+        </w:rPr>
+      </w:pPr>
+      <w:r>
+        <w:rPr>
+          <w:rFonts w:ascii="Bookman Old Style" w:eastAsia="Times New Roman" w:hAnsi="Bookman Old Style" w:cs="Times New Roman"/>
+          <w:kern w:val="0"/>
+          <w14:ligatures w14:val="none"/>
+        </w:rPr>
+        <w:t>A statue may bear a king’s face, but it is not the king himself.</w:t>
+      </w:r>
+    </w:p>
+    <w:p>
+      <w:pPr>
+        <w:rPr>
+          <w:rFonts w:ascii="Bookman Old Style" w:eastAsia="Times New Roman" w:hAnsi="Bookman Old Style" w:cs="Times New Roman"/>
+          <w:kern w:val="0"/>
+          <w14:ligatures w14:val="none"/>
+        </w:rPr>
+      </w:pPr>
+      <w:r>
+        <w:rPr>
+          <w:rFonts w:ascii="Bookman Old Style" w:eastAsia="Times New Roman" w:hAnsi="Bookman Old Style" w:cs="Times New Roman"/>
+          <w:kern w:val="0"/>
+          <w14:ligatures w14:val="none"/>
+        </w:rPr>
+        <w:t xml:space="preserve">Melchizedek is a literal king of a physical city, </w:t>
+      </w:r>
+      <w:r>
+        <w:rPr>
+          <w:rFonts w:ascii="Bookman Old Style" w:eastAsia="Times New Roman" w:hAnsi="Bookman Old Style" w:cs="Times New Roman"/>
+          <w:kern w:val="0"/>
+          <w14:ligatures w14:val="none"/>
+        </w:rPr>
+        <w:t>shah-LAYM.</w:t>
+      </w:r>
+      <w:r>
+        <w:rPr>
+          <w:rFonts w:ascii="Bookman Old Style" w:eastAsia="Times New Roman" w:hAnsi="Bookman Old Style" w:cs="Times New Roman"/>
+          <w:kern w:val="0"/>
+          <w14:ligatures w14:val="none"/>
+        </w:rPr>
+        <w:br/>
+        <w:t>which, by the way, is geographically located</w:t>
+      </w:r>
+      <w:r>
+        <w:rPr>
+          <w:rFonts w:ascii="Bookman Old Style" w:eastAsia="Times New Roman" w:hAnsi="Bookman Old Style" w:cs="Times New Roman"/>
+          <w:kern w:val="0"/>
+          <w14:ligatures w14:val="none"/>
+        </w:rPr>
+        <w:br/>
+        <w:t>where Jerusalem would later stand.</w:t>
+      </w:r>
+    </w:p>
+    <w:p>
+      <w:pPr>
+        <w:rPr>
+          <w:rFonts w:ascii="Bookman Old Style" w:eastAsia="Times New Roman" w:hAnsi="Bookman Old Style" w:cs="Times New Roman"/>
+          <w:kern w:val="0"/>
+          <w14:ligatures w14:val="none"/>
+        </w:rPr>
+      </w:pPr>
+      <w:r>
+        <w:rPr>
+          <w:rFonts w:ascii="Bookman Old Style" w:eastAsia="Times New Roman" w:hAnsi="Bookman Old Style" w:cs="Times New Roman"/>
+          <w:kern w:val="0"/>
+          <w14:ligatures w14:val="none"/>
+        </w:rPr>
         <w:lastRenderedPageBreak/>
-        <w:t>Listen to verses 1-3.</w:t>
-      </w:r>
-    </w:p>
-    <w:p>
-      <w:pPr>
-        <w:rPr>
-          <w:rFonts w:ascii="Bookman Old Style" w:eastAsia="Times New Roman" w:hAnsi="Bookman Old Style" w:cs="Times New Roman"/>
-          <w:i/>
-          <w:iCs/>
-          <w:kern w:val="0"/>
-          <w14:ligatures w14:val="none"/>
-        </w:rPr>
-      </w:pPr>
-      <w:r>
-        <w:rPr>
-          <w:rFonts w:ascii="Bookman Old Style" w:eastAsia="Times New Roman" w:hAnsi="Bookman Old Style" w:cs="Times New Roman"/>
-          <w:i/>
-          <w:iCs/>
-          <w:kern w:val="0"/>
-          <w14:ligatures w14:val="none"/>
-        </w:rPr>
-        <w:t>Read Hebrews 7:1-3</w:t>
-      </w:r>
-    </w:p>
-    <w:p>
-      <w:pPr>
-        <w:rPr>
-          <w:rFonts w:ascii="Bookman Old Style" w:eastAsia="Times New Roman" w:hAnsi="Bookman Old Style" w:cs="Times New Roman"/>
-          <w:kern w:val="0"/>
-          <w14:ligatures w14:val="none"/>
-        </w:rPr>
-      </w:pPr>
-      <w:r>
-        <w:rPr>
-          <w:rFonts w:ascii="Bookman Old Style" w:eastAsia="Times New Roman" w:hAnsi="Bookman Old Style" w:cs="Times New Roman"/>
-          <w:kern w:val="0"/>
-          <w14:ligatures w14:val="none"/>
-        </w:rPr>
-        <w:t>Melchizedek = king of righteousness → Jesus</w:t>
-      </w:r>
-      <w:r>
-        <w:rPr>
-          <w:rFonts w:ascii="Bookman Old Style" w:eastAsia="Times New Roman" w:hAnsi="Bookman Old Style" w:cs="Times New Roman"/>
-          <w:kern w:val="0"/>
-          <w14:ligatures w14:val="none"/>
-        </w:rPr>
-        <w:br/>
-        <w:t>King of Salem = king of peace → Jesus</w:t>
-      </w:r>
-    </w:p>
-    <w:p>
-      <w:pPr>
-        <w:rPr>
-          <w:rFonts w:ascii="Bookman Old Style" w:eastAsia="Times New Roman" w:hAnsi="Bookman Old Style" w:cs="Times New Roman"/>
-          <w:kern w:val="0"/>
-          <w14:ligatures w14:val="none"/>
-        </w:rPr>
-      </w:pPr>
-      <w:r>
-        <w:rPr>
-          <w:rFonts w:ascii="Bookman Old Style" w:eastAsia="Times New Roman" w:hAnsi="Bookman Old Style" w:cs="Times New Roman"/>
-          <w:kern w:val="0"/>
-          <w14:ligatures w14:val="none"/>
-        </w:rPr>
-        <w:t xml:space="preserve">Personally, I prefer </w:t>
-      </w:r>
-      <w:r>
-        <w:rPr>
-          <w:rFonts w:ascii="Bookman Old Style" w:eastAsia="Times New Roman" w:hAnsi="Bookman Old Style" w:cs="Times New Roman"/>
-          <w:kern w:val="0"/>
-          <w14:ligatures w14:val="none"/>
-        </w:rPr>
-        <w:t xml:space="preserve">the sound </w:t>
-      </w:r>
-      <w:r>
-        <w:rPr>
-          <w:rFonts w:ascii="Bookman Old Style" w:eastAsia="Times New Roman" w:hAnsi="Bookman Old Style" w:cs="Times New Roman"/>
-          <w:kern w:val="0"/>
-          <w14:ligatures w14:val="none"/>
-        </w:rPr>
-        <w:t xml:space="preserve">of the </w:t>
-      </w:r>
-      <w:r>
-        <w:rPr>
-          <w:rFonts w:ascii="Bookman Old Style" w:eastAsia="Times New Roman" w:hAnsi="Bookman Old Style" w:cs="Times New Roman"/>
-          <w:kern w:val="0"/>
-          <w14:ligatures w14:val="none"/>
-        </w:rPr>
-        <w:t xml:space="preserve">Hebrew </w:t>
-      </w:r>
-      <w:r>
-        <w:rPr>
-          <w:rFonts w:ascii="Bookman Old Style" w:eastAsia="Times New Roman" w:hAnsi="Bookman Old Style" w:cs="Times New Roman"/>
-          <w:kern w:val="0"/>
-          <w14:ligatures w14:val="none"/>
-        </w:rPr>
-        <w:t>pronunciation</w:t>
-      </w:r>
-      <w:r>
-        <w:rPr>
-          <w:rFonts w:ascii="Bookman Old Style" w:eastAsia="Times New Roman" w:hAnsi="Bookman Old Style" w:cs="Times New Roman"/>
-          <w:kern w:val="0"/>
-          <w14:ligatures w14:val="none"/>
-        </w:rPr>
-        <w:br/>
-      </w:r>
-      <w:r>
-        <w:rPr>
-          <w:rFonts w:ascii="Bookman Old Style" w:eastAsia="Times New Roman" w:hAnsi="Bookman Old Style" w:cs="Times New Roman"/>
-          <w:kern w:val="0"/>
-          <w14:ligatures w14:val="none"/>
-        </w:rPr>
-        <w:t xml:space="preserve">for </w:t>
-      </w:r>
-      <w:r>
-        <w:rPr>
-          <w:rFonts w:ascii="Bookman Old Style" w:eastAsia="Times New Roman" w:hAnsi="Bookman Old Style" w:cs="Times New Roman"/>
-          <w:kern w:val="0"/>
-          <w14:ligatures w14:val="none"/>
-        </w:rPr>
-        <w:t>SAY-lum</w:t>
-      </w:r>
-      <w:r>
-        <w:rPr>
-          <w:rFonts w:ascii="Bookman Old Style" w:eastAsia="Times New Roman" w:hAnsi="Bookman Old Style" w:cs="Times New Roman"/>
-          <w:kern w:val="0"/>
-          <w14:ligatures w14:val="none"/>
-        </w:rPr>
-        <w:t>,</w:t>
-      </w:r>
-      <w:r>
-        <w:rPr>
-          <w:rFonts w:ascii="Bookman Old Style" w:eastAsia="Times New Roman" w:hAnsi="Bookman Old Style" w:cs="Times New Roman"/>
-          <w:kern w:val="0"/>
-          <w14:ligatures w14:val="none"/>
-        </w:rPr>
-        <w:br/>
-      </w:r>
-      <w:r>
-        <w:rPr>
-          <w:rFonts w:ascii="Bookman Old Style" w:eastAsia="Times New Roman" w:hAnsi="Bookman Old Style" w:cs="Times New Roman"/>
-          <w:kern w:val="0"/>
-          <w14:ligatures w14:val="none"/>
-        </w:rPr>
-        <w:t xml:space="preserve">which would sound more like </w:t>
-      </w:r>
-      <w:r>
-        <w:rPr>
-          <w:rFonts w:ascii="Bookman Old Style" w:eastAsia="Times New Roman" w:hAnsi="Bookman Old Style" w:cs="Times New Roman"/>
-          <w:kern w:val="0"/>
-          <w14:ligatures w14:val="none"/>
-        </w:rPr>
-        <w:t>shah-LAYM</w:t>
-      </w:r>
-      <w:r>
-        <w:rPr>
-          <w:rFonts w:ascii="Bookman Old Style" w:eastAsia="Times New Roman" w:hAnsi="Bookman Old Style" w:cs="Times New Roman"/>
-          <w:kern w:val="0"/>
-          <w14:ligatures w14:val="none"/>
-        </w:rPr>
-        <w:t>,</w:t>
-      </w:r>
-      <w:r>
-        <w:rPr>
-          <w:rFonts w:ascii="Bookman Old Style" w:eastAsia="Times New Roman" w:hAnsi="Bookman Old Style" w:cs="Times New Roman"/>
-          <w:kern w:val="0"/>
-          <w14:ligatures w14:val="none"/>
-        </w:rPr>
-        <w:br/>
-        <w:t>because it sounds more like the root word,</w:t>
-      </w:r>
-      <w:r>
-        <w:rPr>
-          <w:rFonts w:ascii="Bookman Old Style" w:eastAsia="Times New Roman" w:hAnsi="Bookman Old Style" w:cs="Times New Roman"/>
-          <w:kern w:val="0"/>
-          <w14:ligatures w14:val="none"/>
-        </w:rPr>
-        <w:br/>
-      </w:r>
-      <w:r>
-        <w:rPr>
-          <w:rFonts w:ascii="Bookman Old Style" w:eastAsia="Times New Roman" w:hAnsi="Bookman Old Style" w:cs="Times New Roman"/>
-          <w:kern w:val="0"/>
-          <w14:ligatures w14:val="none"/>
-        </w:rPr>
-        <w:t>shah-LOHM</w:t>
-      </w:r>
-      <w:r>
-        <w:rPr>
-          <w:rFonts w:ascii="Bookman Old Style" w:eastAsia="Times New Roman" w:hAnsi="Bookman Old Style" w:cs="Times New Roman"/>
-          <w:kern w:val="0"/>
-          <w14:ligatures w14:val="none"/>
-        </w:rPr>
-        <w:t>, for peace.</w:t>
-      </w:r>
-    </w:p>
-    <w:p>
-      <w:pPr>
-        <w:rPr>
-          <w:rFonts w:ascii="Bookman Old Style" w:eastAsia="Times New Roman" w:hAnsi="Bookman Old Style" w:cs="Times New Roman"/>
-          <w:kern w:val="0"/>
-          <w14:ligatures w14:val="none"/>
-        </w:rPr>
-      </w:pPr>
-      <w:r>
-        <w:rPr>
-          <w:rFonts w:ascii="Bookman Old Style" w:eastAsia="Times New Roman" w:hAnsi="Bookman Old Style" w:cs="Times New Roman"/>
-          <w:kern w:val="0"/>
-          <w14:ligatures w14:val="none"/>
-        </w:rPr>
-        <w:t>It has a more gentle and peaceful resonance to it.</w:t>
-      </w:r>
-    </w:p>
-    <w:p>
-      <w:pPr>
-        <w:rPr>
-          <w:rFonts w:ascii="Bookman Old Style" w:eastAsia="Times New Roman" w:hAnsi="Bookman Old Style" w:cs="Times New Roman"/>
-          <w:kern w:val="0"/>
-          <w14:ligatures w14:val="none"/>
-        </w:rPr>
-      </w:pPr>
-      <w:r>
-        <w:rPr>
-          <w:rFonts w:ascii="Bookman Old Style" w:eastAsia="Times New Roman" w:hAnsi="Bookman Old Style" w:cs="Times New Roman"/>
-          <w:kern w:val="0"/>
-          <w14:ligatures w14:val="none"/>
-        </w:rPr>
-        <w:t>Anyway, moving on…</w:t>
-      </w:r>
-    </w:p>
-    <w:p>
-      <w:pPr>
-        <w:rPr>
-          <w:rFonts w:ascii="Bookman Old Style" w:eastAsia="Times New Roman" w:hAnsi="Bookman Old Style" w:cs="Times New Roman"/>
-          <w:kern w:val="0"/>
-          <w14:ligatures w14:val="none"/>
-        </w:rPr>
-      </w:pPr>
-      <w:r>
-        <w:rPr>
-          <w:rFonts w:ascii="Bookman Old Style" w:eastAsia="Times New Roman" w:hAnsi="Bookman Old Style" w:cs="Times New Roman"/>
-          <w:kern w:val="0"/>
-          <w14:ligatures w14:val="none"/>
-        </w:rPr>
-        <w:t>Melchizedek</w:t>
-      </w:r>
-      <w:r>
-        <w:rPr>
-          <w:rFonts w:ascii="Bookman Old Style" w:eastAsia="Times New Roman" w:hAnsi="Bookman Old Style" w:cs="Times New Roman"/>
-          <w:kern w:val="0"/>
-          <w14:ligatures w14:val="none"/>
-        </w:rPr>
-        <w:t xml:space="preserve"> has n</w:t>
-      </w:r>
-      <w:r>
-        <w:rPr>
-          <w:rFonts w:ascii="Bookman Old Style" w:eastAsia="Times New Roman" w:hAnsi="Bookman Old Style" w:cs="Times New Roman"/>
-          <w:kern w:val="0"/>
-          <w14:ligatures w14:val="none"/>
-        </w:rPr>
-        <w:t>o genealogy, beginning, or end:</w:t>
-      </w:r>
-      <w:r>
-        <w:rPr>
-          <w:rFonts w:ascii="Bookman Old Style" w:eastAsia="Times New Roman" w:hAnsi="Bookman Old Style" w:cs="Times New Roman"/>
-          <w:kern w:val="0"/>
-          <w14:ligatures w14:val="none"/>
-        </w:rPr>
-        <w:br/>
-      </w:r>
-      <w:r>
-        <w:rPr>
-          <w:rFonts w:ascii="Bookman Old Style" w:eastAsia="Times New Roman" w:hAnsi="Bookman Old Style" w:cs="Times New Roman"/>
-          <w:kern w:val="0"/>
-          <w14:ligatures w14:val="none"/>
-        </w:rPr>
-        <w:t>This r</w:t>
-      </w:r>
-      <w:r>
-        <w:rPr>
-          <w:rFonts w:ascii="Bookman Old Style" w:eastAsia="Times New Roman" w:hAnsi="Bookman Old Style" w:cs="Times New Roman"/>
-          <w:kern w:val="0"/>
-          <w14:ligatures w14:val="none"/>
-        </w:rPr>
-        <w:t xml:space="preserve">eminds me of </w:t>
-      </w:r>
-      <w:r>
-        <w:rPr>
-          <w:rFonts w:ascii="Bookman Old Style" w:eastAsia="Times New Roman" w:hAnsi="Bookman Old Style" w:cs="Times New Roman"/>
-          <w:kern w:val="0"/>
-          <w14:ligatures w14:val="none"/>
-        </w:rPr>
-        <w:t>a certain title for God the Father</w:t>
-      </w:r>
-      <w:r>
-        <w:rPr>
-          <w:rFonts w:ascii="Bookman Old Style" w:eastAsia="Times New Roman" w:hAnsi="Bookman Old Style" w:cs="Times New Roman"/>
-          <w:kern w:val="0"/>
-          <w14:ligatures w14:val="none"/>
-        </w:rPr>
-        <w:t xml:space="preserve"> —</w:t>
-      </w:r>
-      <w:r>
-        <w:rPr>
-          <w:rFonts w:ascii="Bookman Old Style" w:eastAsia="Times New Roman" w:hAnsi="Bookman Old Style" w:cs="Times New Roman"/>
-          <w:kern w:val="0"/>
-          <w14:ligatures w14:val="none"/>
-        </w:rPr>
-        <w:t xml:space="preserve"> Alpha &amp; Omega</w:t>
-      </w:r>
-      <w:r>
-        <w:rPr>
-          <w:rFonts w:ascii="Bookman Old Style" w:eastAsia="Times New Roman" w:hAnsi="Bookman Old Style" w:cs="Times New Roman"/>
-          <w:kern w:val="0"/>
-          <w14:ligatures w14:val="none"/>
-        </w:rPr>
-        <w:t>.</w:t>
-      </w:r>
-      <w:r>
-        <w:rPr>
-          <w:rFonts w:ascii="Bookman Old Style" w:eastAsia="Times New Roman" w:hAnsi="Bookman Old Style" w:cs="Times New Roman"/>
-          <w:kern w:val="0"/>
-          <w14:ligatures w14:val="none"/>
-        </w:rPr>
-        <w:br/>
-        <w:t xml:space="preserve">Similarly, yet still intentionally submissive to </w:t>
-      </w:r>
-      <w:r>
-        <w:rPr>
-          <w:rFonts w:ascii="Bookman Old Style" w:eastAsia="Times New Roman" w:hAnsi="Bookman Old Style" w:cs="Times New Roman"/>
-          <w:kern w:val="0"/>
-          <w14:ligatures w14:val="none"/>
-        </w:rPr>
-        <w:t>t</w:t>
-      </w:r>
-      <w:r>
-        <w:rPr>
-          <w:rFonts w:ascii="Bookman Old Style" w:eastAsia="Times New Roman" w:hAnsi="Bookman Old Style" w:cs="Times New Roman"/>
-          <w:kern w:val="0"/>
-          <w14:ligatures w14:val="none"/>
-        </w:rPr>
-        <w:t>he Father —</w:t>
-      </w:r>
-      <w:r>
-        <w:rPr>
-          <w:rFonts w:ascii="Bookman Old Style" w:eastAsia="Times New Roman" w:hAnsi="Bookman Old Style" w:cs="Times New Roman"/>
-          <w:kern w:val="0"/>
-          <w14:ligatures w14:val="none"/>
-        </w:rPr>
-        <w:br/>
-      </w:r>
-      <w:r>
-        <w:rPr>
-          <w:rFonts w:ascii="Bookman Old Style" w:eastAsia="Times New Roman" w:hAnsi="Bookman Old Style" w:cs="Times New Roman"/>
-          <w:kern w:val="0"/>
-          <w14:ligatures w14:val="none"/>
-        </w:rPr>
-        <w:t xml:space="preserve">Revelation 1:17 says that Jesus is </w:t>
-      </w:r>
-      <w:r>
-        <w:rPr>
-          <w:rFonts w:ascii="Bookman Old Style" w:eastAsia="Times New Roman" w:hAnsi="Bookman Old Style" w:cs="Times New Roman"/>
-          <w:kern w:val="0"/>
-          <w14:ligatures w14:val="none"/>
-        </w:rPr>
-        <w:t>“the first and the last”</w:t>
-      </w:r>
-      <w:r>
-        <w:rPr>
-          <w:rFonts w:ascii="Bookman Old Style" w:eastAsia="Times New Roman" w:hAnsi="Bookman Old Style" w:cs="Times New Roman"/>
-          <w:kern w:val="0"/>
-          <w14:ligatures w14:val="none"/>
-        </w:rPr>
-        <w:t>.</w:t>
-      </w:r>
-    </w:p>
-    <w:p>
-      <w:pPr>
-        <w:rPr>
-          <w:rFonts w:ascii="Bookman Old Style" w:eastAsia="Times New Roman" w:hAnsi="Bookman Old Style" w:cs="Times New Roman"/>
-          <w:kern w:val="0"/>
-          <w14:ligatures w14:val="none"/>
-        </w:rPr>
-      </w:pPr>
-      <w:r>
-        <w:rPr>
-          <w:rFonts w:ascii="Bookman Old Style" w:eastAsia="Times New Roman" w:hAnsi="Bookman Old Style" w:cs="Times New Roman"/>
-          <w:kern w:val="0"/>
-          <w14:ligatures w14:val="none"/>
-        </w:rPr>
-        <w:t xml:space="preserve">Verse 3 </w:t>
-      </w:r>
-      <w:r>
-        <w:rPr>
-          <w:rFonts w:ascii="Bookman Old Style" w:eastAsia="Times New Roman" w:hAnsi="Bookman Old Style" w:cs="Times New Roman"/>
-          <w:kern w:val="0"/>
-          <w14:ligatures w14:val="none"/>
-        </w:rPr>
-        <w:t>says that</w:t>
-      </w:r>
-      <w:r>
-        <w:rPr>
-          <w:rFonts w:ascii="Bookman Old Style" w:eastAsia="Times New Roman" w:hAnsi="Bookman Old Style" w:cs="Times New Roman"/>
-          <w:kern w:val="0"/>
-          <w14:ligatures w14:val="none"/>
-        </w:rPr>
-        <w:t xml:space="preserve"> Melchizedek “resembles the Son of God”</w:t>
-      </w:r>
-      <w:r>
-        <w:rPr>
-          <w:rFonts w:ascii="Bookman Old Style" w:eastAsia="Times New Roman" w:hAnsi="Bookman Old Style" w:cs="Times New Roman"/>
-          <w:kern w:val="0"/>
-          <w14:ligatures w14:val="none"/>
-        </w:rPr>
-        <w:t>.</w:t>
-      </w:r>
-      <w:r>
-        <w:rPr>
-          <w:rFonts w:ascii="Bookman Old Style" w:eastAsia="Times New Roman" w:hAnsi="Bookman Old Style" w:cs="Times New Roman"/>
-          <w:kern w:val="0"/>
-          <w14:ligatures w14:val="none"/>
-        </w:rPr>
-        <w:br/>
-      </w:r>
-      <w:r>
-        <w:rPr>
-          <w:rFonts w:ascii="Bookman Old Style" w:eastAsia="Times New Roman" w:hAnsi="Bookman Old Style" w:cs="Times New Roman"/>
-          <w:kern w:val="0"/>
-          <w14:ligatures w14:val="none"/>
-        </w:rPr>
-        <w:t>I want to clarify that t</w:t>
-      </w:r>
-      <w:r>
-        <w:rPr>
-          <w:rFonts w:ascii="Bookman Old Style" w:eastAsia="Times New Roman" w:hAnsi="Bookman Old Style" w:cs="Times New Roman"/>
-          <w:kern w:val="0"/>
-          <w14:ligatures w14:val="none"/>
-        </w:rPr>
-        <w:t>his is not a theophany</w:t>
-      </w:r>
-      <w:r>
-        <w:rPr>
-          <w:rFonts w:ascii="Bookman Old Style" w:eastAsia="Times New Roman" w:hAnsi="Bookman Old Style" w:cs="Times New Roman"/>
-          <w:kern w:val="0"/>
-          <w14:ligatures w14:val="none"/>
-        </w:rPr>
-        <w:t xml:space="preserve"> —</w:t>
-      </w:r>
-      <w:r>
-        <w:rPr>
-          <w:rFonts w:ascii="Bookman Old Style" w:eastAsia="Times New Roman" w:hAnsi="Bookman Old Style" w:cs="Times New Roman"/>
-          <w:kern w:val="0"/>
-          <w14:ligatures w14:val="none"/>
-        </w:rPr>
-        <w:br/>
-        <w:t>a literal appearance of God</w:t>
-      </w:r>
-      <w:r>
-        <w:rPr>
-          <w:rFonts w:ascii="Bookman Old Style" w:eastAsia="Times New Roman" w:hAnsi="Bookman Old Style" w:cs="Times New Roman"/>
-          <w:kern w:val="0"/>
-          <w14:ligatures w14:val="none"/>
-        </w:rPr>
-        <w:t xml:space="preserve"> in some form</w:t>
-      </w:r>
-      <w:r>
-        <w:rPr>
-          <w:rFonts w:ascii="Bookman Old Style" w:eastAsia="Times New Roman" w:hAnsi="Bookman Old Style" w:cs="Times New Roman"/>
-          <w:kern w:val="0"/>
-          <w14:ligatures w14:val="none"/>
-        </w:rPr>
-        <w:t xml:space="preserve"> —</w:t>
-      </w:r>
-      <w:r>
-        <w:rPr>
-          <w:rFonts w:ascii="Bookman Old Style" w:eastAsia="Times New Roman" w:hAnsi="Bookman Old Style" w:cs="Times New Roman"/>
-          <w:kern w:val="0"/>
-          <w14:ligatures w14:val="none"/>
-        </w:rPr>
-        <w:br/>
-        <w:t>or a Christophany</w:t>
-      </w:r>
-      <w:r>
-        <w:rPr>
-          <w:rFonts w:ascii="Bookman Old Style" w:eastAsia="Times New Roman" w:hAnsi="Bookman Old Style" w:cs="Times New Roman"/>
-          <w:kern w:val="0"/>
-          <w14:ligatures w14:val="none"/>
-        </w:rPr>
-        <w:t xml:space="preserve"> —</w:t>
-      </w:r>
-      <w:r>
-        <w:rPr>
-          <w:rFonts w:ascii="Bookman Old Style" w:eastAsia="Times New Roman" w:hAnsi="Bookman Old Style" w:cs="Times New Roman"/>
-          <w:kern w:val="0"/>
-          <w14:ligatures w14:val="none"/>
-        </w:rPr>
-        <w:br/>
-      </w:r>
-      <w:r>
-        <w:rPr>
-          <w:rFonts w:ascii="Bookman Old Style" w:eastAsia="Times New Roman" w:hAnsi="Bookman Old Style" w:cs="Times New Roman"/>
-          <w:kern w:val="0"/>
-          <w14:ligatures w14:val="none"/>
-        </w:rPr>
-        <w:t xml:space="preserve">a literal appearance of </w:t>
-      </w:r>
-      <w:r>
-        <w:rPr>
-          <w:rFonts w:ascii="Bookman Old Style" w:eastAsia="Times New Roman" w:hAnsi="Bookman Old Style" w:cs="Times New Roman"/>
-          <w:kern w:val="0"/>
-          <w14:ligatures w14:val="none"/>
-        </w:rPr>
-        <w:t xml:space="preserve">God through </w:t>
-      </w:r>
-      <w:r>
-        <w:rPr>
-          <w:rFonts w:ascii="Bookman Old Style" w:eastAsia="Times New Roman" w:hAnsi="Bookman Old Style" w:cs="Times New Roman"/>
-          <w:kern w:val="0"/>
-          <w14:ligatures w14:val="none"/>
-        </w:rPr>
-        <w:t>Christ.</w:t>
-      </w:r>
-    </w:p>
-    <w:p>
-      <w:pPr>
-        <w:rPr>
-          <w:rFonts w:ascii="Bookman Old Style" w:eastAsia="Times New Roman" w:hAnsi="Bookman Old Style" w:cs="Times New Roman"/>
-          <w:kern w:val="0"/>
-          <w14:ligatures w14:val="none"/>
-        </w:rPr>
-      </w:pPr>
-      <w:r>
-        <w:rPr>
-          <w:rFonts w:ascii="Bookman Old Style" w:eastAsia="Times New Roman" w:hAnsi="Bookman Old Style" w:cs="Times New Roman"/>
-          <w:kern w:val="0"/>
-          <w14:ligatures w14:val="none"/>
-        </w:rPr>
-        <w:t>A statue may bear a king’s face, but it is not the king himself.</w:t>
-      </w:r>
-    </w:p>
-    <w:p>
-      <w:pPr>
-        <w:rPr>
-          <w:rFonts w:ascii="Bookman Old Style" w:eastAsia="Times New Roman" w:hAnsi="Bookman Old Style" w:cs="Times New Roman"/>
-          <w:kern w:val="0"/>
-          <w14:ligatures w14:val="none"/>
-        </w:rPr>
-      </w:pPr>
-      <w:r>
-        <w:rPr>
-          <w:rFonts w:ascii="Bookman Old Style" w:eastAsia="Times New Roman" w:hAnsi="Bookman Old Style" w:cs="Times New Roman"/>
-          <w:kern w:val="0"/>
-          <w14:ligatures w14:val="none"/>
-        </w:rPr>
-        <w:t xml:space="preserve">Melchizedek is a literal king of a physical city, </w:t>
-      </w:r>
-      <w:r>
-        <w:rPr>
-          <w:rFonts w:ascii="Bookman Old Style" w:eastAsia="Times New Roman" w:hAnsi="Bookman Old Style" w:cs="Times New Roman"/>
-          <w:kern w:val="0"/>
-          <w14:ligatures w14:val="none"/>
-        </w:rPr>
-        <w:t>shah-LAYM.</w:t>
-      </w:r>
-      <w:r>
-        <w:rPr>
-          <w:rFonts w:ascii="Bookman Old Style" w:eastAsia="Times New Roman" w:hAnsi="Bookman Old Style" w:cs="Times New Roman"/>
-          <w:kern w:val="0"/>
-          <w14:ligatures w14:val="none"/>
-        </w:rPr>
-        <w:br/>
-        <w:t>which, by the way, is geographically located</w:t>
-      </w:r>
-      <w:r>
-        <w:rPr>
-          <w:rFonts w:ascii="Bookman Old Style" w:eastAsia="Times New Roman" w:hAnsi="Bookman Old Style" w:cs="Times New Roman"/>
-          <w:kern w:val="0"/>
-          <w14:ligatures w14:val="none"/>
-        </w:rPr>
-        <w:br/>
-        <w:t>where Jerusalem would later stand.</w:t>
-      </w:r>
-    </w:p>
-    <w:p>
-      <w:pPr>
-        <w:ind w:left="2160"/>
-        <w:rPr>
-          <w:rFonts w:ascii="Bookman Old Style" w:eastAsia="Times New Roman" w:hAnsi="Bookman Old Style" w:cs="Times New Roman"/>
-          <w:kern w:val="0"/>
-          <w14:ligatures w14:val="none"/>
-        </w:rPr>
-      </w:pPr>
-      <w:r>
-        <w:rPr>
-          <w:rFonts w:ascii="Bookman Old Style" w:eastAsia="Times New Roman" w:hAnsi="Bookman Old Style" w:cs="Times New Roman"/>
-          <w:kern w:val="0"/>
-          <w14:ligatures w14:val="none"/>
-        </w:rPr>
         <w:t>Isn’t that awesome?</w:t>
       </w:r>
       <w:r>
@@ -4066,21 +4399,29 @@
       <w:pPr>
         <w:rPr>
           <w:rFonts w:ascii="Bookman Old Style" w:eastAsia="Times New Roman" w:hAnsi="Bookman Old Style" w:cs="Times New Roman"/>
-          <w:i/>
-          <w:iCs/>
-          <w:kern w:val="0"/>
-          <w14:ligatures w14:val="none"/>
-        </w:rPr>
-      </w:pPr>
-      <w:r>
-        <w:rPr>
-          <w:rFonts w:ascii="Bookman Old Style" w:eastAsia="Times New Roman" w:hAnsi="Bookman Old Style" w:cs="Times New Roman"/>
-          <w:i/>
-          <w:iCs/>
-          <w:kern w:val="0"/>
-          <w14:ligatures w14:val="none"/>
-        </w:rPr>
-        <w:t>Read verses 4-9</w:t>
+          <w:color w:val="5B9BD5" w:themeColor="accent5"/>
+          <w:kern w:val="0"/>
+          <w:vertAlign w:val="superscript"/>
+          <w14:ligatures w14:val="none"/>
+        </w:rPr>
+      </w:pPr>
+      <w:r>
+        <w:rPr>
+          <w:rFonts w:ascii="Bookman Old Style" w:eastAsia="Times New Roman" w:hAnsi="Bookman Old Style" w:cs="Times New Roman"/>
+          <w:color w:val="5B9BD5" w:themeColor="accent5"/>
+          <w:kern w:val="0"/>
+          <w14:ligatures w14:val="none"/>
+        </w:rPr>
+        <w:t>See how great this man was to whom Abraham the patriarch gave a tenth of the spoils! And those descendants of Levi who receive the priestly office have a commandment in the law to take tithes from the people, that is, from their brothers, though these also are descended from Abraham. But this man who does not have his descent from them received tithes from Abraham and blessed him who had the promises. It is beyond dispute that the inferior is blessed by the superior. In the one case tithes are received by mortal men, but in the other case, by one of whom it is testified that he lives. One might even say that Levi himself, who receives tithes, paid tithes through Abraham</w:t>
+      </w:r>
+      <w:r>
+        <w:rPr>
+          <w:rFonts w:ascii="Bookman Old Style" w:eastAsia="Times New Roman" w:hAnsi="Bookman Old Style" w:cs="Times New Roman"/>
+          <w:color w:val="5B9BD5" w:themeColor="accent5"/>
+          <w:kern w:val="0"/>
+          <w14:ligatures w14:val="none"/>
+        </w:rPr>
+        <w:t>…</w:t>
       </w:r>
     </w:p>
     <w:p>
@@ -4127,20 +4468,18 @@
     </w:p>
     <w:p>
       <w:pPr>
-        <w:ind w:left="2160"/>
-        <w:rPr>
-          <w:rFonts w:ascii="Bookman Old Style" w:eastAsia="Times New Roman" w:hAnsi="Bookman Old Style" w:cs="Times New Roman"/>
-          <w:kern w:val="0"/>
-          <w14:ligatures w14:val="none"/>
-        </w:rPr>
-      </w:pPr>
-      <w:r>
-        <w:rPr>
-          <w:rFonts w:ascii="Bookman Old Style" w:eastAsia="Times New Roman" w:hAnsi="Bookman Old Style" w:cs="Times New Roman"/>
-          <w:kern w:val="0"/>
-          <w14:ligatures w14:val="none"/>
-        </w:rPr>
-        <w:lastRenderedPageBreak/>
+        <w:rPr>
+          <w:rFonts w:ascii="Bookman Old Style" w:eastAsia="Times New Roman" w:hAnsi="Bookman Old Style" w:cs="Times New Roman"/>
+          <w:kern w:val="0"/>
+          <w14:ligatures w14:val="none"/>
+        </w:rPr>
+      </w:pPr>
+      <w:r>
+        <w:rPr>
+          <w:rFonts w:ascii="Bookman Old Style" w:eastAsia="Times New Roman" w:hAnsi="Bookman Old Style" w:cs="Times New Roman"/>
+          <w:kern w:val="0"/>
+          <w14:ligatures w14:val="none"/>
+        </w:rPr>
         <w:t>A man was sent out to pursue the lost —</w:t>
       </w:r>
       <w:r>
@@ -4182,7 +4521,6 @@
     </w:p>
     <w:p>
       <w:pPr>
-        <w:ind w:left="2160"/>
         <w:rPr>
           <w:rFonts w:ascii="Bookman Old Style" w:eastAsia="Times New Roman" w:hAnsi="Bookman Old Style" w:cs="Times New Roman"/>
           <w:kern w:val="0"/>
@@ -4209,7 +4547,6 @@
     </w:p>
     <w:p>
       <w:pPr>
-        <w:ind w:left="2160"/>
         <w:rPr>
           <w:rFonts w:ascii="Bookman Old Style" w:eastAsia="Times New Roman" w:hAnsi="Bookman Old Style" w:cs="Times New Roman"/>
           <w:kern w:val="0"/>
@@ -4540,6 +4877,7 @@
           <w:kern w:val="0"/>
           <w14:ligatures w14:val="none"/>
         </w:rPr>
+        <w:lastRenderedPageBreak/>
         <w:t>[</w:t>
       </w:r>
       <w:r>
@@ -4709,32 +5047,6 @@
           <v:rect id="_x0000_i1032" style="width:0;height:1.5pt" o:hralign="center" o:hrstd="t" o:hr="t" fillcolor="#a0a0a0" stroked="f"/>
         </w:pict>
       </w:r>
-    </w:p>
-    <w:p>
-      <w:pPr>
-        <w:spacing w:before="120" w:after="120" w:line="360" w:lineRule="auto"/>
-        <w:outlineLvl w:val="2"/>
-        <w:rPr>
-          <w:rFonts w:ascii="Bookman Old Style" w:eastAsia="Times New Roman" w:hAnsi="Bookman Old Style" w:cs="Times New Roman"/>
-          <w:i/>
-          <w:iCs/>
-          <w:kern w:val="0"/>
-          <w14:ligatures w14:val="none"/>
-        </w:rPr>
-      </w:pPr>
-    </w:p>
-    <w:p>
-      <w:pPr>
-        <w:spacing w:before="120" w:after="120" w:line="360" w:lineRule="auto"/>
-        <w:outlineLvl w:val="2"/>
-        <w:rPr>
-          <w:rFonts w:ascii="Bookman Old Style" w:eastAsia="Times New Roman" w:hAnsi="Bookman Old Style" w:cs="Times New Roman"/>
-          <w:i/>
-          <w:iCs/>
-          <w:kern w:val="0"/>
-          <w14:ligatures w14:val="none"/>
-        </w:rPr>
-      </w:pPr>
     </w:p>
     <w:p>
       <w:pPr>
@@ -4760,7 +5072,6 @@
           <w:kern w:val="0"/>
           <w14:ligatures w14:val="none"/>
         </w:rPr>
-        <w:lastRenderedPageBreak/>
         <w:t>THE RESURRECTION FREEDOM</w:t>
       </w:r>
     </w:p>
@@ -5179,6 +5490,7 @@
           <w:kern w:val="0"/>
           <w14:ligatures w14:val="none"/>
         </w:rPr>
+        <w:lastRenderedPageBreak/>
         <w:t>The Abrahamic Covenant in Genesis 22:18 →</w:t>
       </w:r>
       <w:r>
@@ -5332,7 +5644,6 @@
           <w:kern w:val="0"/>
           <w14:ligatures w14:val="none"/>
         </w:rPr>
-        <w:lastRenderedPageBreak/>
         <w:t>A BETTER COVENANT</w:t>
       </w:r>
     </w:p>
@@ -5442,37 +5753,93 @@
       <w:pPr>
         <w:rPr>
           <w:rFonts w:ascii="Bookman Old Style" w:eastAsia="Times New Roman" w:hAnsi="Bookman Old Style" w:cs="Times New Roman"/>
-          <w:i/>
-          <w:iCs/>
-          <w:kern w:val="0"/>
-          <w14:ligatures w14:val="none"/>
-        </w:rPr>
-      </w:pPr>
-      <w:r>
-        <w:rPr>
-          <w:rFonts w:ascii="Bookman Old Style" w:eastAsia="Times New Roman" w:hAnsi="Bookman Old Style" w:cs="Times New Roman"/>
-          <w:i/>
-          <w:iCs/>
-          <w:kern w:val="0"/>
-          <w14:ligatures w14:val="none"/>
-        </w:rPr>
-        <w:t>Read Hebrews 7:11-17</w:t>
-      </w:r>
-    </w:p>
-    <w:p>
-      <w:pPr>
-        <w:rPr>
-          <w:rFonts w:ascii="Bookman Old Style" w:eastAsia="Times New Roman" w:hAnsi="Bookman Old Style" w:cs="Times New Roman"/>
-          <w:kern w:val="0"/>
-          <w14:ligatures w14:val="none"/>
-        </w:rPr>
-      </w:pPr>
-      <w:r>
-        <w:rPr>
-          <w:rFonts w:ascii="Bookman Old Style" w:eastAsia="Times New Roman" w:hAnsi="Bookman Old Style" w:cs="Times New Roman"/>
-          <w:kern w:val="0"/>
-          <w14:ligatures w14:val="none"/>
-        </w:rPr>
+          <w:color w:val="5B9BD5" w:themeColor="accent5"/>
+          <w:kern w:val="0"/>
+          <w14:ligatures w14:val="none"/>
+        </w:rPr>
+      </w:pPr>
+      <w:r>
+        <w:rPr>
+          <w:rFonts w:ascii="Bookman Old Style" w:eastAsia="Times New Roman" w:hAnsi="Bookman Old Style" w:cs="Times New Roman"/>
+          <w:color w:val="5B9BD5" w:themeColor="accent5"/>
+          <w:kern w:val="0"/>
+          <w14:ligatures w14:val="none"/>
+        </w:rPr>
+        <w:t>Now if perfection had been attainable through the Levitical priesthood (for under it the people received the law), what further need would there have been for another priest to arise after the order of Melchizedek, rather than one named after the order of Aaron? For when there is a change in the priesthood, there is necessarily a change in the law as well. For the one of whom these things are spoken belonged to another tribe, from which no one has ever served at the altar. For it is evident that our Lord was descended from Judah, and in connection with that tribe Moses said nothing about priests.</w:t>
+      </w:r>
+    </w:p>
+    <w:p>
+      <w:pPr>
+        <w:rPr>
+          <w:rFonts w:ascii="Bookman Old Style" w:eastAsia="Times New Roman" w:hAnsi="Bookman Old Style" w:cs="Times New Roman"/>
+          <w:color w:val="5B9BD5" w:themeColor="accent5"/>
+          <w:kern w:val="0"/>
+          <w14:ligatures w14:val="none"/>
+        </w:rPr>
+      </w:pPr>
+      <w:r>
+        <w:rPr>
+          <w:rFonts w:ascii="Bookman Old Style" w:eastAsia="Times New Roman" w:hAnsi="Bookman Old Style" w:cs="Times New Roman"/>
+          <w:color w:val="5B9BD5" w:themeColor="accent5"/>
+          <w:kern w:val="0"/>
+          <w14:ligatures w14:val="none"/>
+        </w:rPr>
+        <w:t>This becomes even more evident when another priest arises in the likeness of Melchizedek, who has become a priest, not on the basis of a legal requirement concerning bodily descent, but by the power of an indestructible life. For it is witnessed of him,</w:t>
+      </w:r>
+    </w:p>
+    <w:p>
+      <w:pPr>
+        <w:rPr>
+          <w:rFonts w:ascii="Bookman Old Style" w:eastAsia="Times New Roman" w:hAnsi="Bookman Old Style" w:cs="Times New Roman"/>
+          <w:color w:val="5B9BD5" w:themeColor="accent5"/>
+          <w:kern w:val="0"/>
+          <w14:ligatures w14:val="none"/>
+        </w:rPr>
+      </w:pPr>
+      <w:r>
+        <w:rPr>
+          <w:rFonts w:ascii="Bookman Old Style" w:eastAsia="Times New Roman" w:hAnsi="Bookman Old Style" w:cs="Times New Roman"/>
+          <w:color w:val="5B9BD5" w:themeColor="accent5"/>
+          <w:kern w:val="0"/>
+          <w14:ligatures w14:val="none"/>
+        </w:rPr>
+        <w:t>“You are a priest forever,</w:t>
+      </w:r>
+      <w:r>
+        <w:rPr>
+          <w:rFonts w:ascii="Bookman Old Style" w:eastAsia="Times New Roman" w:hAnsi="Bookman Old Style" w:cs="Times New Roman"/>
+          <w:color w:val="5B9BD5" w:themeColor="accent5"/>
+          <w:kern w:val="0"/>
+          <w14:ligatures w14:val="none"/>
+        </w:rPr>
+        <w:br/>
+        <w:t xml:space="preserve">          </w:t>
+      </w:r>
+      <w:r>
+        <w:rPr>
+          <w:rFonts w:ascii="Bookman Old Style" w:eastAsia="Times New Roman" w:hAnsi="Bookman Old Style" w:cs="Times New Roman"/>
+          <w:color w:val="5B9BD5" w:themeColor="accent5"/>
+          <w:kern w:val="0"/>
+          <w14:ligatures w14:val="none"/>
+        </w:rPr>
+        <w:t>after the order of Melchizedek.”</w:t>
+      </w:r>
+    </w:p>
+    <w:p>
+      <w:pPr>
+        <w:rPr>
+          <w:rFonts w:ascii="Bookman Old Style" w:eastAsia="Times New Roman" w:hAnsi="Bookman Old Style" w:cs="Times New Roman"/>
+          <w:kern w:val="0"/>
+          <w14:ligatures w14:val="none"/>
+        </w:rPr>
+      </w:pPr>
+      <w:r>
+        <w:rPr>
+          <w:rFonts w:ascii="Bookman Old Style" w:eastAsia="Times New Roman" w:hAnsi="Bookman Old Style" w:cs="Times New Roman"/>
+          <w:kern w:val="0"/>
+          <w14:ligatures w14:val="none"/>
+        </w:rPr>
+        <w:lastRenderedPageBreak/>
         <w:t>There we have it;</w:t>
       </w:r>
       <w:r>
@@ -5515,21 +5882,38 @@
       <w:pPr>
         <w:rPr>
           <w:rFonts w:ascii="Bookman Old Style" w:eastAsia="Times New Roman" w:hAnsi="Bookman Old Style" w:cs="Times New Roman"/>
-          <w:i/>
-          <w:iCs/>
-          <w:kern w:val="0"/>
-          <w14:ligatures w14:val="none"/>
-        </w:rPr>
-      </w:pPr>
-      <w:r>
-        <w:rPr>
-          <w:rFonts w:ascii="Bookman Old Style" w:eastAsia="Times New Roman" w:hAnsi="Bookman Old Style" w:cs="Times New Roman"/>
-          <w:i/>
-          <w:iCs/>
-          <w:kern w:val="0"/>
-          <w14:ligatures w14:val="none"/>
-        </w:rPr>
-        <w:t>Read Hebrews 7:18</w:t>
+          <w:color w:val="5B9BD5" w:themeColor="accent5"/>
+          <w:kern w:val="0"/>
+          <w:vertAlign w:val="superscript"/>
+          <w14:ligatures w14:val="none"/>
+        </w:rPr>
+      </w:pPr>
+      <w:r>
+        <w:rPr>
+          <w:rFonts w:ascii="Bookman Old Style" w:eastAsia="Times New Roman" w:hAnsi="Bookman Old Style" w:cs="Times New Roman"/>
+          <w:color w:val="5B9BD5" w:themeColor="accent5"/>
+          <w:kern w:val="0"/>
+          <w14:ligatures w14:val="none"/>
+        </w:rPr>
+        <w:t>For on the one hand, a former commandment is set aside because of its weakness and uselessness</w:t>
+      </w:r>
+      <w:r>
+        <w:rPr>
+          <w:rFonts w:ascii="Bookman Old Style" w:eastAsia="Times New Roman" w:hAnsi="Bookman Old Style" w:cs="Times New Roman"/>
+          <w:color w:val="5B9BD5" w:themeColor="accent5"/>
+          <w:kern w:val="0"/>
+          <w14:ligatures w14:val="none"/>
+        </w:rPr>
+        <w:t xml:space="preserve"> </w:t>
+      </w:r>
+      <w:r>
+        <w:rPr>
+          <w:rFonts w:ascii="Bookman Old Style" w:eastAsia="Times New Roman" w:hAnsi="Bookman Old Style" w:cs="Times New Roman"/>
+          <w:color w:val="5B9BD5" w:themeColor="accent5"/>
+          <w:kern w:val="0"/>
+          <w14:ligatures w14:val="none"/>
+        </w:rPr>
+        <w:t>(for the law made nothing perfect); but on the other hand, a better hope is introduced, through which we draw near to God.</w:t>
       </w:r>
     </w:p>
     <w:p>
@@ -5638,26 +6022,84 @@
       <w:pPr>
         <w:rPr>
           <w:rFonts w:ascii="Bookman Old Style" w:eastAsia="Times New Roman" w:hAnsi="Bookman Old Style" w:cs="Times New Roman"/>
-          <w:i/>
-          <w:iCs/>
-          <w:kern w:val="0"/>
-          <w14:ligatures w14:val="none"/>
-        </w:rPr>
-      </w:pPr>
-      <w:r>
-        <w:rPr>
-          <w:rFonts w:ascii="Bookman Old Style" w:eastAsia="Times New Roman" w:hAnsi="Bookman Old Style" w:cs="Times New Roman"/>
-          <w:i/>
-          <w:iCs/>
-          <w:kern w:val="0"/>
-          <w14:ligatures w14:val="none"/>
-        </w:rPr>
-        <w:t>Read Hebrews 5:11-14</w:t>
-      </w:r>
-    </w:p>
-    <w:p>
-      <w:pPr>
-        <w:ind w:left="2160"/>
+          <w:color w:val="5B9BD5" w:themeColor="accent5"/>
+          <w:kern w:val="0"/>
+          <w:vertAlign w:val="superscript"/>
+          <w14:ligatures w14:val="none"/>
+        </w:rPr>
+      </w:pPr>
+      <w:r>
+        <w:rPr>
+          <w:rFonts w:ascii="Bookman Old Style" w:eastAsia="Times New Roman" w:hAnsi="Bookman Old Style" w:cs="Times New Roman"/>
+          <w:color w:val="5B9BD5" w:themeColor="accent5"/>
+          <w:kern w:val="0"/>
+          <w14:ligatures w14:val="none"/>
+        </w:rPr>
+        <w:t>About this we have much to say, and it is hard to explain, since you have become dull of hearing.</w:t>
+      </w:r>
+      <w:r>
+        <w:rPr>
+          <w:rFonts w:ascii="Bookman Old Style" w:eastAsia="Times New Roman" w:hAnsi="Bookman Old Style" w:cs="Times New Roman"/>
+          <w:b/>
+          <w:color w:val="5B9BD5" w:themeColor="accent5"/>
+          <w:kern w:val="0"/>
+          <w:vertAlign w:val="superscript"/>
+          <w14:ligatures w14:val="none"/>
+        </w:rPr>
+        <w:t> </w:t>
+      </w:r>
+      <w:r>
+        <w:rPr>
+          <w:rFonts w:ascii="Bookman Old Style" w:eastAsia="Times New Roman" w:hAnsi="Bookman Old Style" w:cs="Times New Roman"/>
+          <w:color w:val="5B9BD5" w:themeColor="accent5"/>
+          <w:kern w:val="0"/>
+          <w14:ligatures w14:val="none"/>
+        </w:rPr>
+        <w:t xml:space="preserve">For though by this </w:t>
+      </w:r>
+      <w:proofErr w:type="gramStart"/>
+      <w:r>
+        <w:rPr>
+          <w:rFonts w:ascii="Bookman Old Style" w:eastAsia="Times New Roman" w:hAnsi="Bookman Old Style" w:cs="Times New Roman"/>
+          <w:color w:val="5B9BD5" w:themeColor="accent5"/>
+          <w:kern w:val="0"/>
+          <w14:ligatures w14:val="none"/>
+        </w:rPr>
+        <w:t>time</w:t>
+      </w:r>
+      <w:proofErr w:type="gramEnd"/>
+      <w:r>
+        <w:rPr>
+          <w:rFonts w:ascii="Bookman Old Style" w:eastAsia="Times New Roman" w:hAnsi="Bookman Old Style" w:cs="Times New Roman"/>
+          <w:color w:val="5B9BD5" w:themeColor="accent5"/>
+          <w:kern w:val="0"/>
+          <w14:ligatures w14:val="none"/>
+        </w:rPr>
+        <w:t xml:space="preserve"> you ought to be teachers, you need someone to teach you again the basic principles of the oracles of God. You need milk, not solid food,</w:t>
+      </w:r>
+      <w:r>
+        <w:rPr>
+          <w:rFonts w:ascii="Bookman Old Style" w:eastAsia="Times New Roman" w:hAnsi="Bookman Old Style" w:cs="Times New Roman"/>
+          <w:b/>
+          <w:color w:val="5B9BD5" w:themeColor="accent5"/>
+          <w:kern w:val="0"/>
+          <w:vertAlign w:val="superscript"/>
+          <w14:ligatures w14:val="none"/>
+        </w:rPr>
+        <w:t> </w:t>
+      </w:r>
+      <w:r>
+        <w:rPr>
+          <w:rFonts w:ascii="Bookman Old Style" w:eastAsia="Times New Roman" w:hAnsi="Bookman Old Style" w:cs="Times New Roman"/>
+          <w:color w:val="5B9BD5" w:themeColor="accent5"/>
+          <w:kern w:val="0"/>
+          <w14:ligatures w14:val="none"/>
+        </w:rPr>
+        <w:t>for everyone who lives on milk is unskilled in the word of righteousness, since he is a child. But solid food is for the mature, for those who have their powers of discernment trained by constant practice to distinguish good from evil.</w:t>
+      </w:r>
+    </w:p>
+    <w:p>
+      <w:pPr>
         <w:rPr>
           <w:rFonts w:ascii="Bookman Old Style" w:eastAsia="Times New Roman" w:hAnsi="Bookman Old Style" w:cs="Times New Roman"/>
           <w:kern w:val="0"/>
@@ -5743,7 +6185,6 @@
     </w:p>
     <w:p>
       <w:pPr>
-        <w:ind w:left="2160"/>
         <w:rPr>
           <w:rFonts w:ascii="Bookman Old Style" w:eastAsia="Times New Roman" w:hAnsi="Bookman Old Style" w:cs="Times New Roman"/>
           <w:kern w:val="0"/>
@@ -5849,19 +6290,6 @@
           <v:rect id="_x0000_i1036" style="width:0;height:1.5pt" o:hralign="center" o:hrstd="t" o:hr="t" fillcolor="#a0a0a0" stroked="f"/>
         </w:pict>
       </w:r>
-    </w:p>
-    <w:p>
-      <w:pPr>
-        <w:spacing w:before="120" w:after="120" w:line="360" w:lineRule="auto"/>
-        <w:outlineLvl w:val="2"/>
-        <w:rPr>
-          <w:rFonts w:ascii="Bookman Old Style" w:eastAsia="Times New Roman" w:hAnsi="Bookman Old Style" w:cs="Times New Roman"/>
-          <w:i/>
-          <w:iCs/>
-          <w:kern w:val="0"/>
-          <w14:ligatures w14:val="none"/>
-        </w:rPr>
-      </w:pPr>
     </w:p>
     <w:p>
       <w:pPr>
@@ -5887,7 +6315,6 @@
           <w:kern w:val="0"/>
           <w14:ligatures w14:val="none"/>
         </w:rPr>
-        <w:lastRenderedPageBreak/>
         <w:t>WARNING AGAINST APOSTASY</w:t>
       </w:r>
     </w:p>
@@ -5916,21 +6343,31 @@
       <w:pPr>
         <w:rPr>
           <w:rFonts w:ascii="Bookman Old Style" w:eastAsia="Times New Roman" w:hAnsi="Bookman Old Style" w:cs="Times New Roman"/>
-          <w:i/>
-          <w:iCs/>
-          <w:kern w:val="0"/>
-          <w14:ligatures w14:val="none"/>
-        </w:rPr>
-      </w:pPr>
-      <w:r>
-        <w:rPr>
-          <w:rFonts w:ascii="Bookman Old Style" w:eastAsia="Times New Roman" w:hAnsi="Bookman Old Style" w:cs="Times New Roman"/>
-          <w:i/>
-          <w:iCs/>
-          <w:kern w:val="0"/>
-          <w14:ligatures w14:val="none"/>
-        </w:rPr>
-        <w:t>Read Hebrews 6:1-8</w:t>
+          <w:color w:val="5B9BD5" w:themeColor="accent5"/>
+          <w:kern w:val="0"/>
+          <w14:ligatures w14:val="none"/>
+        </w:rPr>
+      </w:pPr>
+      <w:proofErr w:type="gramStart"/>
+      <w:r>
+        <w:rPr>
+          <w:rFonts w:ascii="Bookman Old Style" w:eastAsia="Times New Roman" w:hAnsi="Bookman Old Style" w:cs="Times New Roman"/>
+          <w:color w:val="5B9BD5" w:themeColor="accent5"/>
+          <w:kern w:val="0"/>
+          <w14:ligatures w14:val="none"/>
+        </w:rPr>
+        <w:lastRenderedPageBreak/>
+        <w:t>Therefore</w:t>
+      </w:r>
+      <w:proofErr w:type="gramEnd"/>
+      <w:r>
+        <w:rPr>
+          <w:rFonts w:ascii="Bookman Old Style" w:eastAsia="Times New Roman" w:hAnsi="Bookman Old Style" w:cs="Times New Roman"/>
+          <w:color w:val="5B9BD5" w:themeColor="accent5"/>
+          <w:kern w:val="0"/>
+          <w14:ligatures w14:val="none"/>
+        </w:rPr>
+        <w:t xml:space="preserve"> let us leave the elementary doctrine of Christ and go on to maturity, not laying again a foundation of repentance from dead works and of faith toward God, and of instruction about washings, the laying on of hands, the resurrection of the dead, and eternal judgment. And this we will do if God permits. For it is impossible, in the case of those who have once been enlightened, who have tasted the heavenly gift, and have shared in the Holy Spirit, and have tasted the goodness of the word of God and the powers of the age to come, and then have fallen away, to restore them again to repentance, since they are crucifying once again the Son of God to their own harm and holding him up to contempt. For land that has drunk the rain that often falls on it, and produces a crop useful to those for whose sake it is cultivated, receives a blessing from God. But if it bears thorns and thistles, it is worthless and near to being cursed, and its end is to be burned.</w:t>
       </w:r>
     </w:p>
     <w:p>
@@ -6158,10 +6595,9 @@
           <w:rFonts w:ascii="Bookman Old Style" w:eastAsia="Times New Roman" w:hAnsi="Bookman Old Style" w:cs="Times New Roman"/>
           <w:color w:val="5B9BD5" w:themeColor="accent5"/>
           <w:kern w:val="0"/>
-          <w:vertAlign w:val="superscript"/>
-          <w14:ligatures w14:val="none"/>
-        </w:rPr>
-        <w:t>8</w:t>
+          <w14:ligatures w14:val="none"/>
+        </w:rPr>
+        <w:t>But if it bears thorns and thistles,</w:t>
       </w:r>
       <w:r>
         <w:rPr>
@@ -6170,7 +6606,7 @@
           <w:kern w:val="0"/>
           <w14:ligatures w14:val="none"/>
         </w:rPr>
-        <w:t>But if it bears thorns and thistles,</w:t>
+        <w:br/>
       </w:r>
       <w:r>
         <w:rPr>
@@ -6179,7 +6615,7 @@
           <w:kern w:val="0"/>
           <w14:ligatures w14:val="none"/>
         </w:rPr>
-        <w:br/>
+        <w:t>it is worthless and near to being cursed,</w:t>
       </w:r>
       <w:r>
         <w:rPr>
@@ -6188,7 +6624,7 @@
           <w:kern w:val="0"/>
           <w14:ligatures w14:val="none"/>
         </w:rPr>
-        <w:t>it is worthless and near to being cursed,</w:t>
+        <w:br/>
       </w:r>
       <w:r>
         <w:rPr>
@@ -6197,15 +6633,6 @@
           <w:kern w:val="0"/>
           <w14:ligatures w14:val="none"/>
         </w:rPr>
-        <w:br/>
-      </w:r>
-      <w:r>
-        <w:rPr>
-          <w:rFonts w:ascii="Bookman Old Style" w:eastAsia="Times New Roman" w:hAnsi="Bookman Old Style" w:cs="Times New Roman"/>
-          <w:color w:val="5B9BD5" w:themeColor="accent5"/>
-          <w:kern w:val="0"/>
-          <w14:ligatures w14:val="none"/>
-        </w:rPr>
         <w:t>and its end is to be burned.</w:t>
       </w:r>
       <w:r>
@@ -6293,6 +6720,7 @@
           <w:kern w:val="0"/>
           <w14:ligatures w14:val="none"/>
         </w:rPr>
+        <w:lastRenderedPageBreak/>
         <w:t>Understanding and confidence</w:t>
       </w:r>
       <w:r>
@@ -6390,14 +6818,6 @@
           <w14:ligatures w14:val="none"/>
         </w:rPr>
         <w:br/>
-      </w:r>
-      <w:r>
-        <w:rPr>
-          <w:rFonts w:ascii="Bookman Old Style" w:eastAsia="Times New Roman" w:hAnsi="Bookman Old Style" w:cs="Times New Roman"/>
-          <w:kern w:val="0"/>
-          <w14:ligatures w14:val="none"/>
-        </w:rPr>
-        <w:lastRenderedPageBreak/>
         <w:t>and trust that God will continue to refine your spirit</w:t>
       </w:r>
       <w:r>
@@ -6480,7 +6900,6 @@
     </w:p>
     <w:p>
       <w:pPr>
-        <w:ind w:left="2160"/>
         <w:rPr>
           <w:rFonts w:ascii="Bookman Old Style" w:eastAsia="Times New Roman" w:hAnsi="Bookman Old Style" w:cs="Times New Roman"/>
           <w:kern w:val="0"/>
@@ -6683,6 +7102,12 @@
           <w:rFonts w:ascii="Bookman Old Style" w:hAnsi="Bookman Old Style" w:cstheme="minorHAnsi"/>
         </w:rPr>
         <w:br/>
+      </w:r>
+      <w:r>
+        <w:rPr>
+          <w:rFonts w:ascii="Bookman Old Style" w:hAnsi="Bookman Old Style" w:cstheme="minorHAnsi"/>
+        </w:rPr>
+        <w:lastRenderedPageBreak/>
         <w:t>you can follow this podcast</w:t>
       </w:r>
       <w:r>
@@ -9938,7 +10363,6 @@
   <w:style w:type="character" w:default="1" w:styleId="DefaultParagraphFont">
     <w:name w:val="Default Paragraph Font"/>
     <w:uiPriority w:val="1"/>
-    <w:semiHidden/>
     <w:unhideWhenUsed/>
   </w:style>
   <w:style w:type="table" w:default="1" w:styleId="TableNormal">

</xml_diff>